<commit_message>
Unify Restock/Inventory pages, redesign UI, expand inventory API
- Merge RestockPage and product/stock views into a single InventoryPage,
  with a new AppShell layout component shared across routes
- Redesign UI with a glassmorphism/green theme (index.css)
- Expand backend inventory routes/service and productRepository with
  additional stock operations, backed by new service tests
- Bump express to ^5.2.1, add dotenv config (.env.example) and related
  server/seed wiring
</commit_message>
<xml_diff>
--- a/docs/word/detailed_use_cases.docx
+++ b/docs/word/detailed_use_cases.docx
@@ -2,7 +2,7 @@
 <file path=word/document.xml><?xml version="1.0" encoding="utf-8"?>
 <w:document xmlns:w="http://schemas.openxmlformats.org/wordprocessingml/2006/main" xmlns:m="http://schemas.openxmlformats.org/officeDocument/2006/math" xmlns:r="http://schemas.openxmlformats.org/officeDocument/2006/relationships" xmlns:o="urn:schemas-microsoft-com:office:office" xmlns:v="urn:schemas-microsoft-com:vml" xmlns:w10="urn:schemas-microsoft-com:office:word" xmlns:a="http://schemas.openxmlformats.org/drawingml/2006/main" xmlns:pic="http://schemas.openxmlformats.org/drawingml/2006/picture" xmlns:wp="http://schemas.openxmlformats.org/drawingml/2006/wordprocessingDrawing">
   <w:body>
-    <w:bookmarkStart w:id="21" w:name="Xf93b7994dda3f3d816071783b1e68efb751966a"/>
+    <w:bookmarkStart w:id="34" w:name="Xf93b7994dda3f3d816071783b1e68efb751966a"/>
     <w:p>
       <w:pPr>
         <w:pStyle w:val="Heading1"/>
@@ -1227,7 +1227,7 @@
         <w:t xml:space="preserve"> </w:t>
       </w:r>
       <w:r>
-        <w:t xml:space="preserve">Manager is prompted to register a new product variant (style, size, colour, price) before restocking it.</w:t>
+        <w:t xml:space="preserve">Manager is prompted to register a new product variant (style, size, colour, price) before restocking it — see UC5 below.</w:t>
       </w:r>
     </w:p>
     <w:p>
@@ -1261,12 +1261,1155 @@
     </w:p>
     <w:bookmarkEnd w:id="18"/>
     <w:bookmarkEnd w:id="19"/>
-    <w:bookmarkStart w:id="20" w:name="remaining-use-cases-70"/>
+    <w:bookmarkStart w:id="24" w:name="uc5-manage-products-add--edit--remove"/>
     <w:p>
       <w:pPr>
         <w:pStyle w:val="Heading2"/>
       </w:pPr>
       <w:r>
+        <w:t xml:space="preserve">UC5: Manage Products (Add / Edit / Remove)</w:t>
+      </w:r>
+    </w:p>
+    <w:p>
+      <w:pPr>
+        <w:pStyle w:val="FirstParagraph"/>
+      </w:pPr>
+      <w:r>
+        <w:t xml:space="preserve">Fulfills the "add/update/delete items" half of the Manage Inventory functional requirement from</w:t>
+      </w:r>
+      <w:r>
+        <w:t xml:space="preserve"> </w:t>
+      </w:r>
+      <w:hyperlink r:id="rId9">
+        <w:r>
+          <w:rPr>
+            <w:rStyle w:val="Hyperlink"/>
+          </w:rPr>
+          <w:t xml:space="preserve">High-Level Requirements</w:t>
+        </w:r>
+      </w:hyperlink>
+      <w:r>
+        <w:t xml:space="preserve"> </w:t>
+      </w:r>
+      <w:r>
+        <w:t xml:space="preserve">— UC3 above covers the other half (receiving stock for an item that already exists in the catalog).</w:t>
+      </w:r>
+    </w:p>
+    <w:p>
+      <w:pPr>
+        <w:pStyle w:val="Compact"/>
+        <w:numPr>
+          <w:ilvl w:val="0"/>
+          <w:numId w:val="1016"/>
+        </w:numPr>
+      </w:pPr>
+      <w:r>
+        <w:rPr>
+          <w:b/>
+          <w:bCs/>
+        </w:rPr>
+        <w:t xml:space="preserve">Scope:</w:t>
+      </w:r>
+      <w:r>
+        <w:t xml:space="preserve"> </w:t>
+      </w:r>
+      <w:r>
+        <w:t xml:space="preserve">POS Retail Clothing Store System</w:t>
+      </w:r>
+    </w:p>
+    <w:p>
+      <w:pPr>
+        <w:pStyle w:val="Compact"/>
+        <w:numPr>
+          <w:ilvl w:val="0"/>
+          <w:numId w:val="1016"/>
+        </w:numPr>
+      </w:pPr>
+      <w:r>
+        <w:rPr>
+          <w:b/>
+          <w:bCs/>
+        </w:rPr>
+        <w:t xml:space="preserve">Level:</w:t>
+      </w:r>
+      <w:r>
+        <w:t xml:space="preserve"> </w:t>
+      </w:r>
+      <w:r>
+        <w:t xml:space="preserve">User goal</w:t>
+      </w:r>
+    </w:p>
+    <w:p>
+      <w:pPr>
+        <w:pStyle w:val="Compact"/>
+        <w:numPr>
+          <w:ilvl w:val="0"/>
+          <w:numId w:val="1016"/>
+        </w:numPr>
+      </w:pPr>
+      <w:r>
+        <w:rPr>
+          <w:b/>
+          <w:bCs/>
+        </w:rPr>
+        <w:t xml:space="preserve">Primary Actor:</w:t>
+      </w:r>
+      <w:r>
+        <w:t xml:space="preserve"> </w:t>
+      </w:r>
+      <w:r>
+        <w:t xml:space="preserve">Store Manager, Super Admin</w:t>
+      </w:r>
+    </w:p>
+    <w:p>
+      <w:pPr>
+        <w:pStyle w:val="Compact"/>
+        <w:numPr>
+          <w:ilvl w:val="0"/>
+          <w:numId w:val="1016"/>
+        </w:numPr>
+      </w:pPr>
+      <w:r>
+        <w:rPr>
+          <w:b/>
+          <w:bCs/>
+        </w:rPr>
+        <w:t xml:space="preserve">Stakeholders and Interests:</w:t>
+      </w:r>
+    </w:p>
+    <w:p>
+      <w:pPr>
+        <w:pStyle w:val="Compact"/>
+        <w:numPr>
+          <w:ilvl w:val="1"/>
+          <w:numId w:val="1017"/>
+        </w:numPr>
+      </w:pPr>
+      <w:r>
+        <w:rPr>
+          <w:i/>
+          <w:iCs/>
+        </w:rPr>
+        <w:t xml:space="preserve">Store Manager:</w:t>
+      </w:r>
+      <w:r>
+        <w:t xml:space="preserve"> </w:t>
+      </w:r>
+      <w:r>
+        <w:t xml:space="preserve">Wants to add new styles/sizes/colours to the catalog and correct prices without engineering help.</w:t>
+      </w:r>
+    </w:p>
+    <w:p>
+      <w:pPr>
+        <w:pStyle w:val="Compact"/>
+        <w:numPr>
+          <w:ilvl w:val="1"/>
+          <w:numId w:val="1017"/>
+        </w:numPr>
+      </w:pPr>
+      <w:r>
+        <w:rPr>
+          <w:i/>
+          <w:iCs/>
+        </w:rPr>
+        <w:t xml:space="preserve">Cashier:</w:t>
+      </w:r>
+      <w:r>
+        <w:t xml:space="preserve"> </w:t>
+      </w:r>
+      <w:r>
+        <w:t xml:space="preserve">Depends on the catalog being accurate so Process Sale (UC2) never sells a discontinued or mispriced item.</w:t>
+      </w:r>
+    </w:p>
+    <w:p>
+      <w:pPr>
+        <w:pStyle w:val="Compact"/>
+        <w:numPr>
+          <w:ilvl w:val="1"/>
+          <w:numId w:val="1017"/>
+        </w:numPr>
+      </w:pPr>
+      <w:r>
+        <w:rPr>
+          <w:i/>
+          <w:iCs/>
+        </w:rPr>
+        <w:t xml:space="preserve">Super Admin:</w:t>
+      </w:r>
+      <w:r>
+        <w:t xml:space="preserve"> </w:t>
+      </w:r>
+      <w:r>
+        <w:t xml:space="preserve">Wants catalog changes attributable to an authenticated, authorized user, same as UC3.</w:t>
+      </w:r>
+    </w:p>
+    <w:p>
+      <w:pPr>
+        <w:pStyle w:val="Compact"/>
+        <w:numPr>
+          <w:ilvl w:val="0"/>
+          <w:numId w:val="1016"/>
+        </w:numPr>
+      </w:pPr>
+      <w:r>
+        <w:rPr>
+          <w:b/>
+          <w:bCs/>
+        </w:rPr>
+        <w:t xml:space="preserve">Preconditions:</w:t>
+      </w:r>
+      <w:r>
+        <w:t xml:space="preserve"> </w:t>
+      </w:r>
+      <w:r>
+        <w:t xml:space="preserve">Actor is logged in as Store Manager or Super Admin.</w:t>
+      </w:r>
+    </w:p>
+    <w:p>
+      <w:pPr>
+        <w:pStyle w:val="Compact"/>
+        <w:numPr>
+          <w:ilvl w:val="0"/>
+          <w:numId w:val="1016"/>
+        </w:numPr>
+      </w:pPr>
+      <w:r>
+        <w:rPr>
+          <w:b/>
+          <w:bCs/>
+        </w:rPr>
+        <w:t xml:space="preserve">Success Guarantee (Postconditions):</w:t>
+      </w:r>
+      <w:r>
+        <w:t xml:space="preserve"> </w:t>
+      </w:r>
+      <w:r>
+        <w:t xml:space="preserve">The product variant catalog reflects the add/edit/removal; a removed variant cannot subsequently be sold or restocked.</w:t>
+      </w:r>
+    </w:p>
+    <w:bookmarkStart w:id="20" w:name="Xddbdcb6e4b6c95fbedae2ce454e142dd8058bbf"/>
+    <w:p>
+      <w:pPr>
+        <w:pStyle w:val="Heading3"/>
+      </w:pPr>
+      <w:r>
+        <w:t xml:space="preserve">Main Success Scenario (Add Product Variant)</w:t>
+      </w:r>
+    </w:p>
+    <w:p>
+      <w:pPr>
+        <w:pStyle w:val="Compact"/>
+        <w:numPr>
+          <w:ilvl w:val="0"/>
+          <w:numId w:val="1018"/>
+        </w:numPr>
+      </w:pPr>
+      <w:r>
+        <w:t xml:space="preserve">Actor selects "Add Product."</w:t>
+      </w:r>
+    </w:p>
+    <w:p>
+      <w:pPr>
+        <w:pStyle w:val="Compact"/>
+        <w:numPr>
+          <w:ilvl w:val="0"/>
+          <w:numId w:val="1018"/>
+        </w:numPr>
+      </w:pPr>
+      <w:r>
+        <w:t xml:space="preserve">Actor enters a style code, product name, and base price (only required if the style code is new), plus the variant's SKU, size, colour, unit price, and initial quantity on hand.</w:t>
+      </w:r>
+    </w:p>
+    <w:p>
+      <w:pPr>
+        <w:pStyle w:val="Compact"/>
+        <w:numPr>
+          <w:ilvl w:val="0"/>
+          <w:numId w:val="1018"/>
+        </w:numPr>
+      </w:pPr>
+      <w:r>
+        <w:t xml:space="preserve">System validates the SKU is not already in use.</w:t>
+      </w:r>
+    </w:p>
+    <w:p>
+      <w:pPr>
+        <w:pStyle w:val="Compact"/>
+        <w:numPr>
+          <w:ilvl w:val="0"/>
+          <w:numId w:val="1018"/>
+        </w:numPr>
+      </w:pPr>
+      <w:r>
+        <w:t xml:space="preserve">System creates the product specification if the style code is new, then creates the product variant.</w:t>
+      </w:r>
+    </w:p>
+    <w:p>
+      <w:pPr>
+        <w:pStyle w:val="Compact"/>
+        <w:numPr>
+          <w:ilvl w:val="0"/>
+          <w:numId w:val="1018"/>
+        </w:numPr>
+      </w:pPr>
+      <w:r>
+        <w:t xml:space="preserve">System confirms creation.</w:t>
+      </w:r>
+    </w:p>
+    <w:bookmarkEnd w:id="20"/>
+    <w:bookmarkStart w:id="21" w:name="alternate-flow-a-edit-product-variant"/>
+    <w:p>
+      <w:pPr>
+        <w:pStyle w:val="Heading3"/>
+      </w:pPr>
+      <w:r>
+        <w:t xml:space="preserve">Alternate Flow A: Edit Product Variant</w:t>
+      </w:r>
+    </w:p>
+    <w:p>
+      <w:pPr>
+        <w:pStyle w:val="Compact"/>
+        <w:numPr>
+          <w:ilvl w:val="0"/>
+          <w:numId w:val="1019"/>
+        </w:numPr>
+      </w:pPr>
+      <w:r>
+        <w:t xml:space="preserve">Actor selects an existing product variant.</w:t>
+      </w:r>
+    </w:p>
+    <w:p>
+      <w:pPr>
+        <w:pStyle w:val="Compact"/>
+        <w:numPr>
+          <w:ilvl w:val="0"/>
+          <w:numId w:val="1019"/>
+        </w:numPr>
+      </w:pPr>
+      <w:r>
+        <w:t xml:space="preserve">Actor edits size, colour, and/or unit price. (SKU is immutable — a size/colour/style change is a new variant, not an edit, to keep historical sales records unambiguous. Quantity is not edited here — see UC3 for receiving stock.)</w:t>
+      </w:r>
+    </w:p>
+    <w:p>
+      <w:pPr>
+        <w:pStyle w:val="Compact"/>
+        <w:numPr>
+          <w:ilvl w:val="0"/>
+          <w:numId w:val="1019"/>
+        </w:numPr>
+      </w:pPr>
+      <w:r>
+        <w:t xml:space="preserve">System validates the new values and saves them.</w:t>
+      </w:r>
+    </w:p>
+    <w:p>
+      <w:pPr>
+        <w:pStyle w:val="Compact"/>
+        <w:numPr>
+          <w:ilvl w:val="0"/>
+          <w:numId w:val="1019"/>
+        </w:numPr>
+      </w:pPr>
+      <w:r>
+        <w:t xml:space="preserve">System confirms the update.</w:t>
+      </w:r>
+    </w:p>
+    <w:bookmarkEnd w:id="21"/>
+    <w:bookmarkStart w:id="22" w:name="alternate-flow-b-remove-product-variant"/>
+    <w:p>
+      <w:pPr>
+        <w:pStyle w:val="Heading3"/>
+      </w:pPr>
+      <w:r>
+        <w:t xml:space="preserve">Alternate Flow B: Remove Product Variant</w:t>
+      </w:r>
+    </w:p>
+    <w:p>
+      <w:pPr>
+        <w:pStyle w:val="Compact"/>
+        <w:numPr>
+          <w:ilvl w:val="0"/>
+          <w:numId w:val="1020"/>
+        </w:numPr>
+      </w:pPr>
+      <w:r>
+        <w:t xml:space="preserve">Actor selects an existing product variant and requests removal.</w:t>
+      </w:r>
+    </w:p>
+    <w:p>
+      <w:pPr>
+        <w:pStyle w:val="Compact"/>
+        <w:numPr>
+          <w:ilvl w:val="0"/>
+          <w:numId w:val="1020"/>
+        </w:numPr>
+      </w:pPr>
+      <w:r>
+        <w:t xml:space="preserve">System checks whether any sale or stock adjustment references this variant.</w:t>
+      </w:r>
+    </w:p>
+    <w:p>
+      <w:pPr>
+        <w:pStyle w:val="Compact"/>
+        <w:numPr>
+          <w:ilvl w:val="0"/>
+          <w:numId w:val="1020"/>
+        </w:numPr>
+      </w:pPr>
+      <w:r>
+        <w:t xml:space="preserve">If none exist, system deletes the variant and confirms.</w:t>
+      </w:r>
+    </w:p>
+    <w:p>
+      <w:pPr>
+        <w:pStyle w:val="Compact"/>
+        <w:numPr>
+          <w:ilvl w:val="0"/>
+          <w:numId w:val="1020"/>
+        </w:numPr>
+      </w:pPr>
+      <w:r>
+        <w:t xml:space="preserve">If the variant has sales/adjustment history, system rejects the removal (extension 2a) to preserve the audit trail those records depend on.</w:t>
+      </w:r>
+    </w:p>
+    <w:bookmarkEnd w:id="22"/>
+    <w:bookmarkStart w:id="23" w:name="extensions-3"/>
+    <w:p>
+      <w:pPr>
+        <w:pStyle w:val="Heading3"/>
+      </w:pPr>
+      <w:r>
+        <w:t xml:space="preserve">Extensions</w:t>
+      </w:r>
+    </w:p>
+    <w:p>
+      <w:pPr>
+        <w:pStyle w:val="Compact"/>
+        <w:numPr>
+          <w:ilvl w:val="0"/>
+          <w:numId w:val="1021"/>
+        </w:numPr>
+      </w:pPr>
+      <w:r>
+        <w:rPr>
+          <w:b/>
+          <w:bCs/>
+        </w:rPr>
+        <w:t xml:space="preserve">3a (Add).</w:t>
+      </w:r>
+      <w:r>
+        <w:t xml:space="preserve"> </w:t>
+      </w:r>
+      <w:r>
+        <w:t xml:space="preserve">Duplicate SKU -&gt; System rejects; actor picks a different SKU.</w:t>
+      </w:r>
+    </w:p>
+    <w:p>
+      <w:pPr>
+        <w:pStyle w:val="Compact"/>
+        <w:numPr>
+          <w:ilvl w:val="0"/>
+          <w:numId w:val="1021"/>
+        </w:numPr>
+      </w:pPr>
+      <w:r>
+        <w:rPr>
+          <w:b/>
+          <w:bCs/>
+        </w:rPr>
+        <w:t xml:space="preserve">3a (Edit).</w:t>
+      </w:r>
+      <w:r>
+        <w:t xml:space="preserve"> </w:t>
+      </w:r>
+      <w:r>
+        <w:t xml:space="preserve">Unit price ≤ 0 -&gt; System rejects.</w:t>
+      </w:r>
+    </w:p>
+    <w:p>
+      <w:pPr>
+        <w:pStyle w:val="Compact"/>
+        <w:numPr>
+          <w:ilvl w:val="0"/>
+          <w:numId w:val="1021"/>
+        </w:numPr>
+      </w:pPr>
+      <w:r>
+        <w:rPr>
+          <w:b/>
+          <w:bCs/>
+        </w:rPr>
+        <w:t xml:space="preserve">2a (Remove).</w:t>
+      </w:r>
+      <w:r>
+        <w:t xml:space="preserve"> </w:t>
+      </w:r>
+      <w:r>
+        <w:t xml:space="preserve">Variant has sales or stock-adjustment history -&gt; System rejects deletion with an explanatory message. (This iteration has no "discontinue without deleting" flag; that's a reasonable follow-up if this extension is hit often in practice.)</w:t>
+      </w:r>
+    </w:p>
+    <w:p>
+      <w:r>
+        <w:pict>
+          <v:rect style="width:0;height:1.5pt" o:hralign="center" o:hrstd="t" o:hr="t"/>
+        </w:pict>
+      </w:r>
+    </w:p>
+    <w:bookmarkEnd w:id="23"/>
+    <w:bookmarkEnd w:id="24"/>
+    <w:bookmarkStart w:id="32" w:name="X9c6bd5938dc2eb96b6b7006c98cd6d8160e10d2"/>
+    <w:p>
+      <w:pPr>
+        <w:pStyle w:val="Heading2"/>
+      </w:pPr>
+      <w:r>
+        <w:t xml:space="preserve">UC4: Manage Employees (Onboard / Edit / Assign Role / Remove)</w:t>
+      </w:r>
+    </w:p>
+    <w:p>
+      <w:pPr>
+        <w:pStyle w:val="Compact"/>
+        <w:numPr>
+          <w:ilvl w:val="0"/>
+          <w:numId w:val="1022"/>
+        </w:numPr>
+      </w:pPr>
+      <w:r>
+        <w:rPr>
+          <w:b/>
+          <w:bCs/>
+        </w:rPr>
+        <w:t xml:space="preserve">Scope:</w:t>
+      </w:r>
+      <w:r>
+        <w:t xml:space="preserve"> </w:t>
+      </w:r>
+      <w:r>
+        <w:t xml:space="preserve">POS Retail Clothing Store System</w:t>
+      </w:r>
+    </w:p>
+    <w:p>
+      <w:pPr>
+        <w:pStyle w:val="Compact"/>
+        <w:numPr>
+          <w:ilvl w:val="0"/>
+          <w:numId w:val="1022"/>
+        </w:numPr>
+      </w:pPr>
+      <w:r>
+        <w:rPr>
+          <w:b/>
+          <w:bCs/>
+        </w:rPr>
+        <w:t xml:space="preserve">Level:</w:t>
+      </w:r>
+      <w:r>
+        <w:t xml:space="preserve"> </w:t>
+      </w:r>
+      <w:r>
+        <w:t xml:space="preserve">User goal</w:t>
+      </w:r>
+    </w:p>
+    <w:p>
+      <w:pPr>
+        <w:pStyle w:val="Compact"/>
+        <w:numPr>
+          <w:ilvl w:val="0"/>
+          <w:numId w:val="1022"/>
+        </w:numPr>
+      </w:pPr>
+      <w:r>
+        <w:rPr>
+          <w:b/>
+          <w:bCs/>
+        </w:rPr>
+        <w:t xml:space="preserve">Primary Actor:</w:t>
+      </w:r>
+      <w:r>
+        <w:t xml:space="preserve"> </w:t>
+      </w:r>
+      <w:r>
+        <w:t xml:space="preserve">Super Admin</w:t>
+      </w:r>
+    </w:p>
+    <w:p>
+      <w:pPr>
+        <w:pStyle w:val="Compact"/>
+        <w:numPr>
+          <w:ilvl w:val="0"/>
+          <w:numId w:val="1022"/>
+        </w:numPr>
+      </w:pPr>
+      <w:r>
+        <w:rPr>
+          <w:b/>
+          <w:bCs/>
+        </w:rPr>
+        <w:t xml:space="preserve">Stakeholders and Interests:</w:t>
+      </w:r>
+    </w:p>
+    <w:p>
+      <w:pPr>
+        <w:pStyle w:val="Compact"/>
+        <w:numPr>
+          <w:ilvl w:val="1"/>
+          <w:numId w:val="1023"/>
+        </w:numPr>
+      </w:pPr>
+      <w:r>
+        <w:rPr>
+          <w:i/>
+          <w:iCs/>
+        </w:rPr>
+        <w:t xml:space="preserve">Super Admin:</w:t>
+      </w:r>
+      <w:r>
+        <w:t xml:space="preserve"> </w:t>
+      </w:r>
+      <w:r>
+        <w:t xml:space="preserve">Wants a fast, reliable way to bring a new hire into the system with the correct permissions, correct their details or role later, and remove someone who has left.</w:t>
+      </w:r>
+    </w:p>
+    <w:p>
+      <w:pPr>
+        <w:pStyle w:val="Compact"/>
+        <w:numPr>
+          <w:ilvl w:val="1"/>
+          <w:numId w:val="1023"/>
+        </w:numPr>
+      </w:pPr>
+      <w:r>
+        <w:rPr>
+          <w:i/>
+          <w:iCs/>
+        </w:rPr>
+        <w:t xml:space="preserve">Store Manager:</w:t>
+      </w:r>
+      <w:r>
+        <w:t xml:space="preserve"> </w:t>
+      </w:r>
+      <w:r>
+        <w:t xml:space="preserve">Wants new cashiers usable on the register on their first shift.</w:t>
+      </w:r>
+    </w:p>
+    <w:p>
+      <w:pPr>
+        <w:pStyle w:val="Compact"/>
+        <w:numPr>
+          <w:ilvl w:val="1"/>
+          <w:numId w:val="1023"/>
+        </w:numPr>
+      </w:pPr>
+      <w:r>
+        <w:rPr>
+          <w:i/>
+          <w:iCs/>
+        </w:rPr>
+        <w:t xml:space="preserve">New Employee:</w:t>
+      </w:r>
+      <w:r>
+        <w:t xml:space="preserve"> </w:t>
+      </w:r>
+      <w:r>
+        <w:t xml:space="preserve">Wants working credentials from day one.</w:t>
+      </w:r>
+    </w:p>
+    <w:p>
+      <w:pPr>
+        <w:pStyle w:val="Compact"/>
+        <w:numPr>
+          <w:ilvl w:val="0"/>
+          <w:numId w:val="1022"/>
+        </w:numPr>
+      </w:pPr>
+      <w:r>
+        <w:rPr>
+          <w:b/>
+          <w:bCs/>
+        </w:rPr>
+        <w:t xml:space="preserve">Preconditions:</w:t>
+      </w:r>
+      <w:r>
+        <w:t xml:space="preserve"> </w:t>
+      </w:r>
+      <w:r>
+        <w:t xml:space="preserve">Actor is logged in as Super Admin (see UC1: Login).</w:t>
+      </w:r>
+    </w:p>
+    <w:p>
+      <w:pPr>
+        <w:pStyle w:val="Compact"/>
+        <w:numPr>
+          <w:ilvl w:val="0"/>
+          <w:numId w:val="1022"/>
+        </w:numPr>
+      </w:pPr>
+      <w:r>
+        <w:rPr>
+          <w:b/>
+          <w:bCs/>
+        </w:rPr>
+        <w:t xml:space="preserve">Success Guarantee (Postconditions):</w:t>
+      </w:r>
+      <w:r>
+        <w:t xml:space="preserve"> </w:t>
+      </w:r>
+      <w:r>
+        <w:t xml:space="preserve">The employee record reflects the create/edit/role-change/removal. A newly onboarded employee can immediately log in with their role's permissions; a removed employee can no longer log in.</w:t>
+      </w:r>
+    </w:p>
+    <w:bookmarkStart w:id="25" w:name="main-success-scenario-onboard"/>
+    <w:p>
+      <w:pPr>
+        <w:pStyle w:val="Heading3"/>
+      </w:pPr>
+      <w:r>
+        <w:t xml:space="preserve">Main Success Scenario (Onboard)</w:t>
+      </w:r>
+    </w:p>
+    <w:p>
+      <w:pPr>
+        <w:pStyle w:val="Compact"/>
+        <w:numPr>
+          <w:ilvl w:val="0"/>
+          <w:numId w:val="1024"/>
+        </w:numPr>
+      </w:pPr>
+      <w:r>
+        <w:t xml:space="preserve">Super Admin selects "Onboard Employee."</w:t>
+      </w:r>
+    </w:p>
+    <w:p>
+      <w:pPr>
+        <w:pStyle w:val="Compact"/>
+        <w:numPr>
+          <w:ilvl w:val="0"/>
+          <w:numId w:val="1024"/>
+        </w:numPr>
+      </w:pPr>
+      <w:r>
+        <w:t xml:space="preserve">Super Admin enters the new employee's name, a unique username, an initial password, and selects a role.</w:t>
+      </w:r>
+    </w:p>
+    <w:p>
+      <w:pPr>
+        <w:pStyle w:val="Compact"/>
+        <w:numPr>
+          <w:ilvl w:val="0"/>
+          <w:numId w:val="1024"/>
+        </w:numPr>
+      </w:pPr>
+      <w:r>
+        <w:t xml:space="preserve">System validates the username is not already taken and the role is one of the three valid roles.</w:t>
+      </w:r>
+    </w:p>
+    <w:p>
+      <w:pPr>
+        <w:pStyle w:val="Compact"/>
+        <w:numPr>
+          <w:ilvl w:val="0"/>
+          <w:numId w:val="1024"/>
+        </w:numPr>
+      </w:pPr>
+      <w:r>
+        <w:t xml:space="preserve">System hashes the password, creates the employee record, and confirms creation to the Super Admin.</w:t>
+      </w:r>
+    </w:p>
+    <w:p>
+      <w:pPr>
+        <w:pStyle w:val="Compact"/>
+        <w:numPr>
+          <w:ilvl w:val="0"/>
+          <w:numId w:val="1024"/>
+        </w:numPr>
+      </w:pPr>
+      <w:r>
+        <w:t xml:space="preserve">Super Admin communicates the initial credentials to the new employee out of band (this system does not email credentials in this iteration).</w:t>
+      </w:r>
+    </w:p>
+    <w:bookmarkEnd w:id="25"/>
+    <w:bookmarkStart w:id="26" w:name="alternate-flow-a-edit-employee-details"/>
+    <w:p>
+      <w:pPr>
+        <w:pStyle w:val="Heading3"/>
+      </w:pPr>
+      <w:r>
+        <w:t xml:space="preserve">Alternate Flow A: Edit Employee Details</w:t>
+      </w:r>
+    </w:p>
+    <w:p>
+      <w:pPr>
+        <w:pStyle w:val="Compact"/>
+        <w:numPr>
+          <w:ilvl w:val="0"/>
+          <w:numId w:val="1025"/>
+        </w:numPr>
+      </w:pPr>
+      <w:r>
+        <w:t xml:space="preserve">Super Admin selects an existing employee from the employee list.</w:t>
+      </w:r>
+    </w:p>
+    <w:p>
+      <w:pPr>
+        <w:pStyle w:val="Compact"/>
+        <w:numPr>
+          <w:ilvl w:val="0"/>
+          <w:numId w:val="1025"/>
+        </w:numPr>
+      </w:pPr>
+      <w:r>
+        <w:t xml:space="preserve">Super Admin edits the employee's name and/or username.</w:t>
+      </w:r>
+    </w:p>
+    <w:p>
+      <w:pPr>
+        <w:pStyle w:val="Compact"/>
+        <w:numPr>
+          <w:ilvl w:val="0"/>
+          <w:numId w:val="1025"/>
+        </w:numPr>
+      </w:pPr>
+      <w:r>
+        <w:t xml:space="preserve">System validates (e.g. username still unique) and saves the changes.</w:t>
+      </w:r>
+    </w:p>
+    <w:p>
+      <w:pPr>
+        <w:pStyle w:val="Compact"/>
+        <w:numPr>
+          <w:ilvl w:val="0"/>
+          <w:numId w:val="1025"/>
+        </w:numPr>
+      </w:pPr>
+      <w:r>
+        <w:t xml:space="preserve">System confirms.</w:t>
+      </w:r>
+    </w:p>
+    <w:bookmarkEnd w:id="26"/>
+    <w:bookmarkStart w:id="27" w:name="alternate-flow-b-assignchange-role"/>
+    <w:p>
+      <w:pPr>
+        <w:pStyle w:val="Heading3"/>
+      </w:pPr>
+      <w:r>
+        <w:t xml:space="preserve">Alternate Flow B: Assign/Change Role</w:t>
+      </w:r>
+    </w:p>
+    <w:p>
+      <w:pPr>
+        <w:pStyle w:val="Compact"/>
+        <w:numPr>
+          <w:ilvl w:val="0"/>
+          <w:numId w:val="1026"/>
+        </w:numPr>
+      </w:pPr>
+      <w:r>
+        <w:t xml:space="preserve">Super Admin selects an existing employee from the employee list.</w:t>
+      </w:r>
+    </w:p>
+    <w:p>
+      <w:pPr>
+        <w:pStyle w:val="Compact"/>
+        <w:numPr>
+          <w:ilvl w:val="0"/>
+          <w:numId w:val="1026"/>
+        </w:numPr>
+      </w:pPr>
+      <w:r>
+        <w:t xml:space="preserve">Super Admin selects a new role for that employee.</w:t>
+      </w:r>
+    </w:p>
+    <w:p>
+      <w:pPr>
+        <w:pStyle w:val="Compact"/>
+        <w:numPr>
+          <w:ilvl w:val="0"/>
+          <w:numId w:val="1026"/>
+        </w:numPr>
+      </w:pPr>
+      <w:r>
+        <w:t xml:space="preserve">System updates the employee's role and confirms.</w:t>
+      </w:r>
+    </w:p>
+    <w:bookmarkEnd w:id="27"/>
+    <w:bookmarkStart w:id="28" w:name="alternate-flow-c-remove-employee"/>
+    <w:p>
+      <w:pPr>
+        <w:pStyle w:val="Heading3"/>
+      </w:pPr>
+      <w:r>
+        <w:t xml:space="preserve">Alternate Flow C: Remove Employee</w:t>
+      </w:r>
+    </w:p>
+    <w:p>
+      <w:pPr>
+        <w:pStyle w:val="Compact"/>
+        <w:numPr>
+          <w:ilvl w:val="0"/>
+          <w:numId w:val="1027"/>
+        </w:numPr>
+      </w:pPr>
+      <w:r>
+        <w:t xml:space="preserve">Super Admin selects an existing employee and requests removal.</w:t>
+      </w:r>
+    </w:p>
+    <w:p>
+      <w:pPr>
+        <w:pStyle w:val="Compact"/>
+        <w:numPr>
+          <w:ilvl w:val="0"/>
+          <w:numId w:val="1027"/>
+        </w:numPr>
+      </w:pPr>
+      <w:r>
+        <w:t xml:space="preserve">System deactivates the employee's account (soft delete —</w:t>
+      </w:r>
+      <w:r>
+        <w:t xml:space="preserve"> </w:t>
+      </w:r>
+      <w:r>
+        <w:rPr>
+          <w:rStyle w:val="VerbatimChar"/>
+        </w:rPr>
+        <w:t xml:space="preserve">is_active = 0</w:t>
+      </w:r>
+      <w:r>
+        <w:t xml:space="preserve">, not a hard delete) so their historical sales/stock-adjustment records remain intact and attributable.</w:t>
+      </w:r>
+    </w:p>
+    <w:p>
+      <w:pPr>
+        <w:pStyle w:val="Compact"/>
+        <w:numPr>
+          <w:ilvl w:val="0"/>
+          <w:numId w:val="1027"/>
+        </w:numPr>
+      </w:pPr>
+      <w:r>
+        <w:t xml:space="preserve">System confirms; the employee can no longer log in (UC1 extension 2b already handles a disabled account at login).</w:t>
+      </w:r>
+    </w:p>
+    <w:bookmarkEnd w:id="28"/>
+    <w:bookmarkStart w:id="29" w:name="extensions-4"/>
+    <w:p>
+      <w:pPr>
+        <w:pStyle w:val="Heading3"/>
+      </w:pPr>
+      <w:r>
+        <w:t xml:space="preserve">Extensions</w:t>
+      </w:r>
+    </w:p>
+    <w:p>
+      <w:pPr>
+        <w:pStyle w:val="Compact"/>
+        <w:numPr>
+          <w:ilvl w:val="0"/>
+          <w:numId w:val="1028"/>
+        </w:numPr>
+      </w:pPr>
+      <w:r>
+        <w:rPr>
+          <w:b/>
+          <w:bCs/>
+        </w:rPr>
+        <w:t xml:space="preserve">3a (Onboard).</w:t>
+      </w:r>
+      <w:r>
+        <w:t xml:space="preserve"> </w:t>
+      </w:r>
+      <w:r>
+        <w:t xml:space="preserve">Username already taken -&gt; System rejects the request; Super Admin picks a different username.</w:t>
+      </w:r>
+    </w:p>
+    <w:p>
+      <w:pPr>
+        <w:pStyle w:val="Compact"/>
+        <w:numPr>
+          <w:ilvl w:val="0"/>
+          <w:numId w:val="1028"/>
+        </w:numPr>
+      </w:pPr>
+      <w:r>
+        <w:rPr>
+          <w:b/>
+          <w:bCs/>
+        </w:rPr>
+        <w:t xml:space="preserve">3b (Onboard).</w:t>
+      </w:r>
+      <w:r>
+        <w:t xml:space="preserve"> </w:t>
+      </w:r>
+      <w:r>
+        <w:t xml:space="preserve">Invalid role value -&gt; System rejects the request; only</w:t>
+      </w:r>
+      <w:r>
+        <w:t xml:space="preserve"> </w:t>
+      </w:r>
+      <w:r>
+        <w:rPr>
+          <w:rStyle w:val="VerbatimChar"/>
+        </w:rPr>
+        <w:t xml:space="preserve">cashier</w:t>
+      </w:r>
+      <w:r>
+        <w:t xml:space="preserve">,</w:t>
+      </w:r>
+      <w:r>
+        <w:t xml:space="preserve"> </w:t>
+      </w:r>
+      <w:r>
+        <w:rPr>
+          <w:rStyle w:val="VerbatimChar"/>
+        </w:rPr>
+        <w:t xml:space="preserve">manager</w:t>
+      </w:r>
+      <w:r>
+        <w:t xml:space="preserve">,</w:t>
+      </w:r>
+      <w:r>
+        <w:t xml:space="preserve"> </w:t>
+      </w:r>
+      <w:r>
+        <w:rPr>
+          <w:rStyle w:val="VerbatimChar"/>
+        </w:rPr>
+        <w:t xml:space="preserve">superadmin</w:t>
+      </w:r>
+      <w:r>
+        <w:t xml:space="preserve"> </w:t>
+      </w:r>
+      <w:r>
+        <w:t xml:space="preserve">are accepted.</w:t>
+      </w:r>
+    </w:p>
+    <w:p>
+      <w:pPr>
+        <w:pStyle w:val="Compact"/>
+        <w:numPr>
+          <w:ilvl w:val="0"/>
+          <w:numId w:val="1028"/>
+        </w:numPr>
+      </w:pPr>
+      <w:r>
+        <w:rPr>
+          <w:b/>
+          <w:bCs/>
+        </w:rPr>
+        <w:t xml:space="preserve">3c (Onboard).</w:t>
+      </w:r>
+      <w:r>
+        <w:t xml:space="preserve"> </w:t>
+      </w:r>
+      <w:r>
+        <w:t xml:space="preserve">Weak/empty password -&gt; System rejects the request with a minimum-length requirement (suggest: 8+ characters, matching typical course-project security expectations).</w:t>
+      </w:r>
+    </w:p>
+    <w:p>
+      <w:pPr>
+        <w:pStyle w:val="Compact"/>
+        <w:numPr>
+          <w:ilvl w:val="0"/>
+          <w:numId w:val="1028"/>
+        </w:numPr>
+      </w:pPr>
+      <w:r>
+        <w:rPr>
+          <w:b/>
+          <w:bCs/>
+        </w:rPr>
+        <w:t xml:space="preserve">3a (Edit).</w:t>
+      </w:r>
+      <w:r>
+        <w:t xml:space="preserve"> </w:t>
+      </w:r>
+      <w:r>
+        <w:t xml:space="preserve">New username already taken by another employee -&gt; System rejects.</w:t>
+      </w:r>
+    </w:p>
+    <w:p>
+      <w:pPr>
+        <w:pStyle w:val="Compact"/>
+        <w:numPr>
+          <w:ilvl w:val="0"/>
+          <w:numId w:val="1028"/>
+        </w:numPr>
+      </w:pPr>
+      <w:r>
+        <w:rPr>
+          <w:b/>
+          <w:bCs/>
+        </w:rPr>
+        <w:t xml:space="preserve">1a (Assign/Change Role, Remove).</w:t>
+      </w:r>
+      <w:r>
+        <w:t xml:space="preserve"> </w:t>
+      </w:r>
+      <w:r>
+        <w:t xml:space="preserve">Super Admin targets their own account (self-demotion or self-removal), or the last remaining active Super Admin -&gt; System warns and requires confirmation, since it can strand the store with no Super Admin. Deciding the exact safeguard is an open design question for whoever implements this (see the design note below).</w:t>
+      </w:r>
+    </w:p>
+    <w:bookmarkEnd w:id="29"/>
+    <w:bookmarkStart w:id="31" w:name="design-note-for-implementer"/>
+    <w:p>
+      <w:pPr>
+        <w:pStyle w:val="Heading3"/>
+      </w:pPr>
+      <w:r>
+        <w:t xml:space="preserve">Design Note for Implementer</w:t>
+      </w:r>
+    </w:p>
+    <w:p>
+      <w:pPr>
+        <w:pStyle w:val="FirstParagraph"/>
+      </w:pPr>
+      <w:r>
+        <w:t xml:space="preserve">This use case's design should also serve as the specification for the role-based access control already enforced (by convention) across UC1-UC3 — i.e., implementing this is a good forcing function to double check every existing route's</w:t>
+      </w:r>
+      <w:r>
+        <w:t xml:space="preserve"> </w:t>
+      </w:r>
+      <w:r>
+        <w:rPr>
+          <w:rStyle w:val="VerbatimChar"/>
+        </w:rPr>
+        <w:t xml:space="preserve">requireRole(...)</w:t>
+      </w:r>
+      <w:r>
+        <w:t xml:space="preserve"> </w:t>
+      </w:r>
+      <w:r>
+        <w:t xml:space="preserve">list against</w:t>
+      </w:r>
+      <w:r>
+        <w:t xml:space="preserve"> </w:t>
+      </w:r>
+      <w:hyperlink r:id="rId30">
+        <w:r>
+          <w:rPr>
+            <w:rStyle w:val="Hyperlink"/>
+          </w:rPr>
+          <w:t xml:space="preserve">Domain Model</w:t>
+        </w:r>
+      </w:hyperlink>
+      <w:r>
+        <w:t xml:space="preserve">'s "Super Admin has access to all roles" rule.</w:t>
+      </w:r>
+    </w:p>
+    <w:p>
+      <w:r>
+        <w:pict>
+          <v:rect style="width:0;height:1.5pt" o:hralign="center" o:hrstd="t" o:hr="t"/>
+        </w:pict>
+      </w:r>
+    </w:p>
+    <w:bookmarkEnd w:id="31"/>
+    <w:bookmarkEnd w:id="32"/>
+    <w:bookmarkStart w:id="33" w:name="remaining-use-cases-70"/>
+    <w:p>
+      <w:pPr>
+        <w:pStyle w:val="Heading2"/>
+      </w:pPr>
+      <w:r>
         <w:t xml:space="preserve">Remaining Use Cases (70%)</w:t>
       </w:r>
     </w:p>
@@ -1275,48 +2418,27 @@
         <w:pStyle w:val="FirstParagraph"/>
       </w:pPr>
       <w:r>
-        <w:t xml:space="preserve">The remaining 5 use cases from the high-level requirements —</w:t>
-      </w:r>
-      <w:r>
-        <w:t xml:space="preserve"> </w:t>
-      </w:r>
-      <w:r>
-        <w:rPr>
-          <w:b/>
-          <w:bCs/>
-        </w:rPr>
-        <w:t xml:space="preserve">View Stock Levels, Generate Sales Reports, Manage Employees, Register Customer, and Onboard Employee &amp; Assign Role (Super Admin)</w:t>
-      </w:r>
-      <w:r>
-        <w:t xml:space="preserve"> </w:t>
-      </w:r>
-      <w:r>
-        <w:t xml:space="preserve">— are deferred to Elaboration Iteration 2, per the course's iteration plan.</w:t>
-      </w:r>
-    </w:p>
-    <w:p>
-      <w:pPr>
-        <w:pStyle w:val="BodyText"/>
-      </w:pPr>
-      <w:r>
-        <w:t xml:space="preserve">Note on scope for</w:t>
-      </w:r>
-      <w:r>
-        <w:t xml:space="preserve"> </w:t>
-      </w:r>
-      <w:r>
-        <w:rPr>
-          <w:b/>
-          <w:bCs/>
-        </w:rPr>
-        <w:t xml:space="preserve">Onboard Employee &amp; Assign Role</w:t>
-      </w:r>
-      <w:r>
-        <w:t xml:space="preserve">: this use case's primary actor is the Super Admin, who is the only actor permitted to create employee accounts and assign them a role (Cashier, Store Manager, or Super Admin). Because the Super Admin also has the combined permissions of every other role, this use case's design (Elaboration Iteration 2) should double as the specification for the role-based access control enforced across all other use cases.</w:t>
-      </w:r>
-    </w:p>
-    <w:bookmarkEnd w:id="20"/>
-    <w:bookmarkEnd w:id="21"/>
+        <w:t xml:space="preserve">UC4 and UC5 above are now detailed. The remaining 3 use cases from the high-level requirements —</w:t>
+      </w:r>
+      <w:r>
+        <w:t xml:space="preserve"> </w:t>
+      </w:r>
+      <w:r>
+        <w:rPr>
+          <w:b/>
+          <w:bCs/>
+        </w:rPr>
+        <w:t xml:space="preserve">View Stock Levels, Generate Sales Reports, and Register Customer</w:t>
+      </w:r>
+      <w:r>
+        <w:t xml:space="preserve"> </w:t>
+      </w:r>
+      <w:r>
+        <w:t xml:space="preserve">— are still deferred to later Elaboration/Construction iterations.</w:t>
+      </w:r>
+    </w:p>
+    <w:bookmarkEnd w:id="33"/>
+    <w:bookmarkEnd w:id="34"/>
     <w:sectPr>
       <w:footnotePr>
         <w:numRestart w:val="eachSect"/>
@@ -1796,6 +2918,234 @@
     </w:lvlOverride>
   </w:num>
   <w:num w:numId="1015">
+    <w:abstractNumId w:val="991"/>
+  </w:num>
+  <w:num w:numId="1016">
+    <w:abstractNumId w:val="991"/>
+  </w:num>
+  <w:num w:numId="1017">
+    <w:abstractNumId w:val="991"/>
+  </w:num>
+  <w:num w:numId="1018">
+    <w:abstractNumId w:val="99411"/>
+    <w:lvlOverride w:ilvl="0">
+      <w:startOverride w:val="1"/>
+    </w:lvlOverride>
+    <w:lvlOverride w:ilvl="1">
+      <w:startOverride w:val="1"/>
+    </w:lvlOverride>
+    <w:lvlOverride w:ilvl="2">
+      <w:startOverride w:val="1"/>
+    </w:lvlOverride>
+    <w:lvlOverride w:ilvl="3">
+      <w:startOverride w:val="1"/>
+    </w:lvlOverride>
+    <w:lvlOverride w:ilvl="4">
+      <w:startOverride w:val="1"/>
+    </w:lvlOverride>
+    <w:lvlOverride w:ilvl="5">
+      <w:startOverride w:val="1"/>
+    </w:lvlOverride>
+    <w:lvlOverride w:ilvl="6">
+      <w:startOverride w:val="1"/>
+    </w:lvlOverride>
+    <w:lvlOverride w:ilvl="7">
+      <w:startOverride w:val="1"/>
+    </w:lvlOverride>
+    <w:lvlOverride w:ilvl="8">
+      <w:startOverride w:val="1"/>
+    </w:lvlOverride>
+  </w:num>
+  <w:num w:numId="1019">
+    <w:abstractNumId w:val="99411"/>
+    <w:lvlOverride w:ilvl="0">
+      <w:startOverride w:val="1"/>
+    </w:lvlOverride>
+    <w:lvlOverride w:ilvl="1">
+      <w:startOverride w:val="1"/>
+    </w:lvlOverride>
+    <w:lvlOverride w:ilvl="2">
+      <w:startOverride w:val="1"/>
+    </w:lvlOverride>
+    <w:lvlOverride w:ilvl="3">
+      <w:startOverride w:val="1"/>
+    </w:lvlOverride>
+    <w:lvlOverride w:ilvl="4">
+      <w:startOverride w:val="1"/>
+    </w:lvlOverride>
+    <w:lvlOverride w:ilvl="5">
+      <w:startOverride w:val="1"/>
+    </w:lvlOverride>
+    <w:lvlOverride w:ilvl="6">
+      <w:startOverride w:val="1"/>
+    </w:lvlOverride>
+    <w:lvlOverride w:ilvl="7">
+      <w:startOverride w:val="1"/>
+    </w:lvlOverride>
+    <w:lvlOverride w:ilvl="8">
+      <w:startOverride w:val="1"/>
+    </w:lvlOverride>
+  </w:num>
+  <w:num w:numId="1020">
+    <w:abstractNumId w:val="99411"/>
+    <w:lvlOverride w:ilvl="0">
+      <w:startOverride w:val="1"/>
+    </w:lvlOverride>
+    <w:lvlOverride w:ilvl="1">
+      <w:startOverride w:val="1"/>
+    </w:lvlOverride>
+    <w:lvlOverride w:ilvl="2">
+      <w:startOverride w:val="1"/>
+    </w:lvlOverride>
+    <w:lvlOverride w:ilvl="3">
+      <w:startOverride w:val="1"/>
+    </w:lvlOverride>
+    <w:lvlOverride w:ilvl="4">
+      <w:startOverride w:val="1"/>
+    </w:lvlOverride>
+    <w:lvlOverride w:ilvl="5">
+      <w:startOverride w:val="1"/>
+    </w:lvlOverride>
+    <w:lvlOverride w:ilvl="6">
+      <w:startOverride w:val="1"/>
+    </w:lvlOverride>
+    <w:lvlOverride w:ilvl="7">
+      <w:startOverride w:val="1"/>
+    </w:lvlOverride>
+    <w:lvlOverride w:ilvl="8">
+      <w:startOverride w:val="1"/>
+    </w:lvlOverride>
+  </w:num>
+  <w:num w:numId="1021">
+    <w:abstractNumId w:val="991"/>
+  </w:num>
+  <w:num w:numId="1022">
+    <w:abstractNumId w:val="991"/>
+  </w:num>
+  <w:num w:numId="1023">
+    <w:abstractNumId w:val="991"/>
+  </w:num>
+  <w:num w:numId="1024">
+    <w:abstractNumId w:val="99411"/>
+    <w:lvlOverride w:ilvl="0">
+      <w:startOverride w:val="1"/>
+    </w:lvlOverride>
+    <w:lvlOverride w:ilvl="1">
+      <w:startOverride w:val="1"/>
+    </w:lvlOverride>
+    <w:lvlOverride w:ilvl="2">
+      <w:startOverride w:val="1"/>
+    </w:lvlOverride>
+    <w:lvlOverride w:ilvl="3">
+      <w:startOverride w:val="1"/>
+    </w:lvlOverride>
+    <w:lvlOverride w:ilvl="4">
+      <w:startOverride w:val="1"/>
+    </w:lvlOverride>
+    <w:lvlOverride w:ilvl="5">
+      <w:startOverride w:val="1"/>
+    </w:lvlOverride>
+    <w:lvlOverride w:ilvl="6">
+      <w:startOverride w:val="1"/>
+    </w:lvlOverride>
+    <w:lvlOverride w:ilvl="7">
+      <w:startOverride w:val="1"/>
+    </w:lvlOverride>
+    <w:lvlOverride w:ilvl="8">
+      <w:startOverride w:val="1"/>
+    </w:lvlOverride>
+  </w:num>
+  <w:num w:numId="1025">
+    <w:abstractNumId w:val="99411"/>
+    <w:lvlOverride w:ilvl="0">
+      <w:startOverride w:val="1"/>
+    </w:lvlOverride>
+    <w:lvlOverride w:ilvl="1">
+      <w:startOverride w:val="1"/>
+    </w:lvlOverride>
+    <w:lvlOverride w:ilvl="2">
+      <w:startOverride w:val="1"/>
+    </w:lvlOverride>
+    <w:lvlOverride w:ilvl="3">
+      <w:startOverride w:val="1"/>
+    </w:lvlOverride>
+    <w:lvlOverride w:ilvl="4">
+      <w:startOverride w:val="1"/>
+    </w:lvlOverride>
+    <w:lvlOverride w:ilvl="5">
+      <w:startOverride w:val="1"/>
+    </w:lvlOverride>
+    <w:lvlOverride w:ilvl="6">
+      <w:startOverride w:val="1"/>
+    </w:lvlOverride>
+    <w:lvlOverride w:ilvl="7">
+      <w:startOverride w:val="1"/>
+    </w:lvlOverride>
+    <w:lvlOverride w:ilvl="8">
+      <w:startOverride w:val="1"/>
+    </w:lvlOverride>
+  </w:num>
+  <w:num w:numId="1026">
+    <w:abstractNumId w:val="99411"/>
+    <w:lvlOverride w:ilvl="0">
+      <w:startOverride w:val="1"/>
+    </w:lvlOverride>
+    <w:lvlOverride w:ilvl="1">
+      <w:startOverride w:val="1"/>
+    </w:lvlOverride>
+    <w:lvlOverride w:ilvl="2">
+      <w:startOverride w:val="1"/>
+    </w:lvlOverride>
+    <w:lvlOverride w:ilvl="3">
+      <w:startOverride w:val="1"/>
+    </w:lvlOverride>
+    <w:lvlOverride w:ilvl="4">
+      <w:startOverride w:val="1"/>
+    </w:lvlOverride>
+    <w:lvlOverride w:ilvl="5">
+      <w:startOverride w:val="1"/>
+    </w:lvlOverride>
+    <w:lvlOverride w:ilvl="6">
+      <w:startOverride w:val="1"/>
+    </w:lvlOverride>
+    <w:lvlOverride w:ilvl="7">
+      <w:startOverride w:val="1"/>
+    </w:lvlOverride>
+    <w:lvlOverride w:ilvl="8">
+      <w:startOverride w:val="1"/>
+    </w:lvlOverride>
+  </w:num>
+  <w:num w:numId="1027">
+    <w:abstractNumId w:val="99411"/>
+    <w:lvlOverride w:ilvl="0">
+      <w:startOverride w:val="1"/>
+    </w:lvlOverride>
+    <w:lvlOverride w:ilvl="1">
+      <w:startOverride w:val="1"/>
+    </w:lvlOverride>
+    <w:lvlOverride w:ilvl="2">
+      <w:startOverride w:val="1"/>
+    </w:lvlOverride>
+    <w:lvlOverride w:ilvl="3">
+      <w:startOverride w:val="1"/>
+    </w:lvlOverride>
+    <w:lvlOverride w:ilvl="4">
+      <w:startOverride w:val="1"/>
+    </w:lvlOverride>
+    <w:lvlOverride w:ilvl="5">
+      <w:startOverride w:val="1"/>
+    </w:lvlOverride>
+    <w:lvlOverride w:ilvl="6">
+      <w:startOverride w:val="1"/>
+    </w:lvlOverride>
+    <w:lvlOverride w:ilvl="7">
+      <w:startOverride w:val="1"/>
+    </w:lvlOverride>
+    <w:lvlOverride w:ilvl="8">
+      <w:startOverride w:val="1"/>
+    </w:lvlOverride>
+  </w:num>
+  <w:num w:numId="1028">
     <w:abstractNumId w:val="991"/>
   </w:num>
 </w:numbering>

</xml_diff>

<commit_message>
Add dashboard and sales reports
</commit_message>
<xml_diff>
--- a/docs/word/detailed_use_cases.docx
+++ b/docs/word/detailed_use_cases.docx
@@ -2,7 +2,7 @@
 <file path=word/document.xml><?xml version="1.0" encoding="utf-8"?>
 <w:document xmlns:w="http://schemas.openxmlformats.org/wordprocessingml/2006/main" xmlns:m="http://schemas.openxmlformats.org/officeDocument/2006/math" xmlns:r="http://schemas.openxmlformats.org/officeDocument/2006/relationships" xmlns:o="urn:schemas-microsoft-com:office:office" xmlns:v="urn:schemas-microsoft-com:vml" xmlns:w10="urn:schemas-microsoft-com:office:word" xmlns:a="http://schemas.openxmlformats.org/drawingml/2006/main" xmlns:pic="http://schemas.openxmlformats.org/drawingml/2006/picture" xmlns:wp="http://schemas.openxmlformats.org/drawingml/2006/wordprocessingDrawing">
   <w:body>
-    <w:bookmarkStart w:id="21" w:name="Xf93b7994dda3f3d816071783b1e68efb751966a"/>
+    <w:bookmarkStart w:id="34" w:name="Xf93b7994dda3f3d816071783b1e68efb751966a"/>
     <w:p>
       <w:pPr>
         <w:pStyle w:val="Heading1"/>
@@ -1227,7 +1227,7 @@
         <w:t xml:space="preserve"> </w:t>
       </w:r>
       <w:r>
-        <w:t xml:space="preserve">Manager is prompted to register a new product variant (style, size, colour, price) before restocking it.</w:t>
+        <w:t xml:space="preserve">Manager is prompted to register a new product variant (style, size, colour, price) before restocking it — see UC5 below.</w:t>
       </w:r>
     </w:p>
     <w:p>
@@ -1261,12 +1261,1155 @@
     </w:p>
     <w:bookmarkEnd w:id="18"/>
     <w:bookmarkEnd w:id="19"/>
-    <w:bookmarkStart w:id="20" w:name="remaining-use-cases-70"/>
+    <w:bookmarkStart w:id="24" w:name="uc5-manage-products-add--edit--remove"/>
     <w:p>
       <w:pPr>
         <w:pStyle w:val="Heading2"/>
       </w:pPr>
       <w:r>
+        <w:t xml:space="preserve">UC5: Manage Products (Add / Edit / Remove)</w:t>
+      </w:r>
+    </w:p>
+    <w:p>
+      <w:pPr>
+        <w:pStyle w:val="FirstParagraph"/>
+      </w:pPr>
+      <w:r>
+        <w:t xml:space="preserve">Fulfills the "add/update/delete items" half of the Manage Inventory functional requirement from</w:t>
+      </w:r>
+      <w:r>
+        <w:t xml:space="preserve"> </w:t>
+      </w:r>
+      <w:hyperlink r:id="rId9">
+        <w:r>
+          <w:rPr>
+            <w:rStyle w:val="Hyperlink"/>
+          </w:rPr>
+          <w:t xml:space="preserve">High-Level Requirements</w:t>
+        </w:r>
+      </w:hyperlink>
+      <w:r>
+        <w:t xml:space="preserve"> </w:t>
+      </w:r>
+      <w:r>
+        <w:t xml:space="preserve">— UC3 above covers the other half (receiving stock for an item that already exists in the catalog).</w:t>
+      </w:r>
+    </w:p>
+    <w:p>
+      <w:pPr>
+        <w:pStyle w:val="Compact"/>
+        <w:numPr>
+          <w:ilvl w:val="0"/>
+          <w:numId w:val="1016"/>
+        </w:numPr>
+      </w:pPr>
+      <w:r>
+        <w:rPr>
+          <w:b/>
+          <w:bCs/>
+        </w:rPr>
+        <w:t xml:space="preserve">Scope:</w:t>
+      </w:r>
+      <w:r>
+        <w:t xml:space="preserve"> </w:t>
+      </w:r>
+      <w:r>
+        <w:t xml:space="preserve">POS Retail Clothing Store System</w:t>
+      </w:r>
+    </w:p>
+    <w:p>
+      <w:pPr>
+        <w:pStyle w:val="Compact"/>
+        <w:numPr>
+          <w:ilvl w:val="0"/>
+          <w:numId w:val="1016"/>
+        </w:numPr>
+      </w:pPr>
+      <w:r>
+        <w:rPr>
+          <w:b/>
+          <w:bCs/>
+        </w:rPr>
+        <w:t xml:space="preserve">Level:</w:t>
+      </w:r>
+      <w:r>
+        <w:t xml:space="preserve"> </w:t>
+      </w:r>
+      <w:r>
+        <w:t xml:space="preserve">User goal</w:t>
+      </w:r>
+    </w:p>
+    <w:p>
+      <w:pPr>
+        <w:pStyle w:val="Compact"/>
+        <w:numPr>
+          <w:ilvl w:val="0"/>
+          <w:numId w:val="1016"/>
+        </w:numPr>
+      </w:pPr>
+      <w:r>
+        <w:rPr>
+          <w:b/>
+          <w:bCs/>
+        </w:rPr>
+        <w:t xml:space="preserve">Primary Actor:</w:t>
+      </w:r>
+      <w:r>
+        <w:t xml:space="preserve"> </w:t>
+      </w:r>
+      <w:r>
+        <w:t xml:space="preserve">Store Manager, Super Admin</w:t>
+      </w:r>
+    </w:p>
+    <w:p>
+      <w:pPr>
+        <w:pStyle w:val="Compact"/>
+        <w:numPr>
+          <w:ilvl w:val="0"/>
+          <w:numId w:val="1016"/>
+        </w:numPr>
+      </w:pPr>
+      <w:r>
+        <w:rPr>
+          <w:b/>
+          <w:bCs/>
+        </w:rPr>
+        <w:t xml:space="preserve">Stakeholders and Interests:</w:t>
+      </w:r>
+    </w:p>
+    <w:p>
+      <w:pPr>
+        <w:pStyle w:val="Compact"/>
+        <w:numPr>
+          <w:ilvl w:val="1"/>
+          <w:numId w:val="1017"/>
+        </w:numPr>
+      </w:pPr>
+      <w:r>
+        <w:rPr>
+          <w:i/>
+          <w:iCs/>
+        </w:rPr>
+        <w:t xml:space="preserve">Store Manager:</w:t>
+      </w:r>
+      <w:r>
+        <w:t xml:space="preserve"> </w:t>
+      </w:r>
+      <w:r>
+        <w:t xml:space="preserve">Wants to add new styles/sizes/colours to the catalog and correct prices without engineering help.</w:t>
+      </w:r>
+    </w:p>
+    <w:p>
+      <w:pPr>
+        <w:pStyle w:val="Compact"/>
+        <w:numPr>
+          <w:ilvl w:val="1"/>
+          <w:numId w:val="1017"/>
+        </w:numPr>
+      </w:pPr>
+      <w:r>
+        <w:rPr>
+          <w:i/>
+          <w:iCs/>
+        </w:rPr>
+        <w:t xml:space="preserve">Cashier:</w:t>
+      </w:r>
+      <w:r>
+        <w:t xml:space="preserve"> </w:t>
+      </w:r>
+      <w:r>
+        <w:t xml:space="preserve">Depends on the catalog being accurate so Process Sale (UC2) never sells a discontinued or mispriced item.</w:t>
+      </w:r>
+    </w:p>
+    <w:p>
+      <w:pPr>
+        <w:pStyle w:val="Compact"/>
+        <w:numPr>
+          <w:ilvl w:val="1"/>
+          <w:numId w:val="1017"/>
+        </w:numPr>
+      </w:pPr>
+      <w:r>
+        <w:rPr>
+          <w:i/>
+          <w:iCs/>
+        </w:rPr>
+        <w:t xml:space="preserve">Super Admin:</w:t>
+      </w:r>
+      <w:r>
+        <w:t xml:space="preserve"> </w:t>
+      </w:r>
+      <w:r>
+        <w:t xml:space="preserve">Wants catalog changes attributable to an authenticated, authorized user, same as UC3.</w:t>
+      </w:r>
+    </w:p>
+    <w:p>
+      <w:pPr>
+        <w:pStyle w:val="Compact"/>
+        <w:numPr>
+          <w:ilvl w:val="0"/>
+          <w:numId w:val="1016"/>
+        </w:numPr>
+      </w:pPr>
+      <w:r>
+        <w:rPr>
+          <w:b/>
+          <w:bCs/>
+        </w:rPr>
+        <w:t xml:space="preserve">Preconditions:</w:t>
+      </w:r>
+      <w:r>
+        <w:t xml:space="preserve"> </w:t>
+      </w:r>
+      <w:r>
+        <w:t xml:space="preserve">Actor is logged in as Store Manager or Super Admin.</w:t>
+      </w:r>
+    </w:p>
+    <w:p>
+      <w:pPr>
+        <w:pStyle w:val="Compact"/>
+        <w:numPr>
+          <w:ilvl w:val="0"/>
+          <w:numId w:val="1016"/>
+        </w:numPr>
+      </w:pPr>
+      <w:r>
+        <w:rPr>
+          <w:b/>
+          <w:bCs/>
+        </w:rPr>
+        <w:t xml:space="preserve">Success Guarantee (Postconditions):</w:t>
+      </w:r>
+      <w:r>
+        <w:t xml:space="preserve"> </w:t>
+      </w:r>
+      <w:r>
+        <w:t xml:space="preserve">The product variant catalog reflects the add/edit/removal; a removed variant cannot subsequently be sold or restocked.</w:t>
+      </w:r>
+    </w:p>
+    <w:bookmarkStart w:id="20" w:name="Xddbdcb6e4b6c95fbedae2ce454e142dd8058bbf"/>
+    <w:p>
+      <w:pPr>
+        <w:pStyle w:val="Heading3"/>
+      </w:pPr>
+      <w:r>
+        <w:t xml:space="preserve">Main Success Scenario (Add Product Variant)</w:t>
+      </w:r>
+    </w:p>
+    <w:p>
+      <w:pPr>
+        <w:pStyle w:val="Compact"/>
+        <w:numPr>
+          <w:ilvl w:val="0"/>
+          <w:numId w:val="1018"/>
+        </w:numPr>
+      </w:pPr>
+      <w:r>
+        <w:t xml:space="preserve">Actor selects "Add Product."</w:t>
+      </w:r>
+    </w:p>
+    <w:p>
+      <w:pPr>
+        <w:pStyle w:val="Compact"/>
+        <w:numPr>
+          <w:ilvl w:val="0"/>
+          <w:numId w:val="1018"/>
+        </w:numPr>
+      </w:pPr>
+      <w:r>
+        <w:t xml:space="preserve">Actor enters a style code, product name, and base price (only required if the style code is new), plus the variant's SKU, size, colour, unit price, and initial quantity on hand.</w:t>
+      </w:r>
+    </w:p>
+    <w:p>
+      <w:pPr>
+        <w:pStyle w:val="Compact"/>
+        <w:numPr>
+          <w:ilvl w:val="0"/>
+          <w:numId w:val="1018"/>
+        </w:numPr>
+      </w:pPr>
+      <w:r>
+        <w:t xml:space="preserve">System validates the SKU is not already in use.</w:t>
+      </w:r>
+    </w:p>
+    <w:p>
+      <w:pPr>
+        <w:pStyle w:val="Compact"/>
+        <w:numPr>
+          <w:ilvl w:val="0"/>
+          <w:numId w:val="1018"/>
+        </w:numPr>
+      </w:pPr>
+      <w:r>
+        <w:t xml:space="preserve">System creates the product specification if the style code is new, then creates the product variant.</w:t>
+      </w:r>
+    </w:p>
+    <w:p>
+      <w:pPr>
+        <w:pStyle w:val="Compact"/>
+        <w:numPr>
+          <w:ilvl w:val="0"/>
+          <w:numId w:val="1018"/>
+        </w:numPr>
+      </w:pPr>
+      <w:r>
+        <w:t xml:space="preserve">System confirms creation.</w:t>
+      </w:r>
+    </w:p>
+    <w:bookmarkEnd w:id="20"/>
+    <w:bookmarkStart w:id="21" w:name="alternate-flow-a-edit-product-variant"/>
+    <w:p>
+      <w:pPr>
+        <w:pStyle w:val="Heading3"/>
+      </w:pPr>
+      <w:r>
+        <w:t xml:space="preserve">Alternate Flow A: Edit Product Variant</w:t>
+      </w:r>
+    </w:p>
+    <w:p>
+      <w:pPr>
+        <w:pStyle w:val="Compact"/>
+        <w:numPr>
+          <w:ilvl w:val="0"/>
+          <w:numId w:val="1019"/>
+        </w:numPr>
+      </w:pPr>
+      <w:r>
+        <w:t xml:space="preserve">Actor selects an existing product variant.</w:t>
+      </w:r>
+    </w:p>
+    <w:p>
+      <w:pPr>
+        <w:pStyle w:val="Compact"/>
+        <w:numPr>
+          <w:ilvl w:val="0"/>
+          <w:numId w:val="1019"/>
+        </w:numPr>
+      </w:pPr>
+      <w:r>
+        <w:t xml:space="preserve">Actor edits size, colour, and/or unit price. (SKU is immutable — a size/colour/style change is a new variant, not an edit, to keep historical sales records unambiguous. Quantity is not edited here — see UC3 for receiving stock.)</w:t>
+      </w:r>
+    </w:p>
+    <w:p>
+      <w:pPr>
+        <w:pStyle w:val="Compact"/>
+        <w:numPr>
+          <w:ilvl w:val="0"/>
+          <w:numId w:val="1019"/>
+        </w:numPr>
+      </w:pPr>
+      <w:r>
+        <w:t xml:space="preserve">System validates the new values and saves them.</w:t>
+      </w:r>
+    </w:p>
+    <w:p>
+      <w:pPr>
+        <w:pStyle w:val="Compact"/>
+        <w:numPr>
+          <w:ilvl w:val="0"/>
+          <w:numId w:val="1019"/>
+        </w:numPr>
+      </w:pPr>
+      <w:r>
+        <w:t xml:space="preserve">System confirms the update.</w:t>
+      </w:r>
+    </w:p>
+    <w:bookmarkEnd w:id="21"/>
+    <w:bookmarkStart w:id="22" w:name="alternate-flow-b-remove-product-variant"/>
+    <w:p>
+      <w:pPr>
+        <w:pStyle w:val="Heading3"/>
+      </w:pPr>
+      <w:r>
+        <w:t xml:space="preserve">Alternate Flow B: Remove Product Variant</w:t>
+      </w:r>
+    </w:p>
+    <w:p>
+      <w:pPr>
+        <w:pStyle w:val="Compact"/>
+        <w:numPr>
+          <w:ilvl w:val="0"/>
+          <w:numId w:val="1020"/>
+        </w:numPr>
+      </w:pPr>
+      <w:r>
+        <w:t xml:space="preserve">Actor selects an existing product variant and requests removal.</w:t>
+      </w:r>
+    </w:p>
+    <w:p>
+      <w:pPr>
+        <w:pStyle w:val="Compact"/>
+        <w:numPr>
+          <w:ilvl w:val="0"/>
+          <w:numId w:val="1020"/>
+        </w:numPr>
+      </w:pPr>
+      <w:r>
+        <w:t xml:space="preserve">System checks whether any sale or stock adjustment references this variant.</w:t>
+      </w:r>
+    </w:p>
+    <w:p>
+      <w:pPr>
+        <w:pStyle w:val="Compact"/>
+        <w:numPr>
+          <w:ilvl w:val="0"/>
+          <w:numId w:val="1020"/>
+        </w:numPr>
+      </w:pPr>
+      <w:r>
+        <w:t xml:space="preserve">If none exist, system deletes the variant and confirms.</w:t>
+      </w:r>
+    </w:p>
+    <w:p>
+      <w:pPr>
+        <w:pStyle w:val="Compact"/>
+        <w:numPr>
+          <w:ilvl w:val="0"/>
+          <w:numId w:val="1020"/>
+        </w:numPr>
+      </w:pPr>
+      <w:r>
+        <w:t xml:space="preserve">If the variant has sales/adjustment history, system rejects the removal (extension 2a) to preserve the audit trail those records depend on.</w:t>
+      </w:r>
+    </w:p>
+    <w:bookmarkEnd w:id="22"/>
+    <w:bookmarkStart w:id="23" w:name="extensions-3"/>
+    <w:p>
+      <w:pPr>
+        <w:pStyle w:val="Heading3"/>
+      </w:pPr>
+      <w:r>
+        <w:t xml:space="preserve">Extensions</w:t>
+      </w:r>
+    </w:p>
+    <w:p>
+      <w:pPr>
+        <w:pStyle w:val="Compact"/>
+        <w:numPr>
+          <w:ilvl w:val="0"/>
+          <w:numId w:val="1021"/>
+        </w:numPr>
+      </w:pPr>
+      <w:r>
+        <w:rPr>
+          <w:b/>
+          <w:bCs/>
+        </w:rPr>
+        <w:t xml:space="preserve">3a (Add).</w:t>
+      </w:r>
+      <w:r>
+        <w:t xml:space="preserve"> </w:t>
+      </w:r>
+      <w:r>
+        <w:t xml:space="preserve">Duplicate SKU -&gt; System rejects; actor picks a different SKU.</w:t>
+      </w:r>
+    </w:p>
+    <w:p>
+      <w:pPr>
+        <w:pStyle w:val="Compact"/>
+        <w:numPr>
+          <w:ilvl w:val="0"/>
+          <w:numId w:val="1021"/>
+        </w:numPr>
+      </w:pPr>
+      <w:r>
+        <w:rPr>
+          <w:b/>
+          <w:bCs/>
+        </w:rPr>
+        <w:t xml:space="preserve">3a (Edit).</w:t>
+      </w:r>
+      <w:r>
+        <w:t xml:space="preserve"> </w:t>
+      </w:r>
+      <w:r>
+        <w:t xml:space="preserve">Unit price ≤ 0 -&gt; System rejects.</w:t>
+      </w:r>
+    </w:p>
+    <w:p>
+      <w:pPr>
+        <w:pStyle w:val="Compact"/>
+        <w:numPr>
+          <w:ilvl w:val="0"/>
+          <w:numId w:val="1021"/>
+        </w:numPr>
+      </w:pPr>
+      <w:r>
+        <w:rPr>
+          <w:b/>
+          <w:bCs/>
+        </w:rPr>
+        <w:t xml:space="preserve">2a (Remove).</w:t>
+      </w:r>
+      <w:r>
+        <w:t xml:space="preserve"> </w:t>
+      </w:r>
+      <w:r>
+        <w:t xml:space="preserve">Variant has sales or stock-adjustment history -&gt; System rejects deletion with an explanatory message. (This iteration has no "discontinue without deleting" flag; that's a reasonable follow-up if this extension is hit often in practice.)</w:t>
+      </w:r>
+    </w:p>
+    <w:p>
+      <w:r>
+        <w:pict>
+          <v:rect style="width:0;height:1.5pt" o:hralign="center" o:hrstd="t" o:hr="t"/>
+        </w:pict>
+      </w:r>
+    </w:p>
+    <w:bookmarkEnd w:id="23"/>
+    <w:bookmarkEnd w:id="24"/>
+    <w:bookmarkStart w:id="32" w:name="X9c6bd5938dc2eb96b6b7006c98cd6d8160e10d2"/>
+    <w:p>
+      <w:pPr>
+        <w:pStyle w:val="Heading2"/>
+      </w:pPr>
+      <w:r>
+        <w:t xml:space="preserve">UC4: Manage Employees (Onboard / Edit / Assign Role / Remove)</w:t>
+      </w:r>
+    </w:p>
+    <w:p>
+      <w:pPr>
+        <w:pStyle w:val="Compact"/>
+        <w:numPr>
+          <w:ilvl w:val="0"/>
+          <w:numId w:val="1022"/>
+        </w:numPr>
+      </w:pPr>
+      <w:r>
+        <w:rPr>
+          <w:b/>
+          <w:bCs/>
+        </w:rPr>
+        <w:t xml:space="preserve">Scope:</w:t>
+      </w:r>
+      <w:r>
+        <w:t xml:space="preserve"> </w:t>
+      </w:r>
+      <w:r>
+        <w:t xml:space="preserve">POS Retail Clothing Store System</w:t>
+      </w:r>
+    </w:p>
+    <w:p>
+      <w:pPr>
+        <w:pStyle w:val="Compact"/>
+        <w:numPr>
+          <w:ilvl w:val="0"/>
+          <w:numId w:val="1022"/>
+        </w:numPr>
+      </w:pPr>
+      <w:r>
+        <w:rPr>
+          <w:b/>
+          <w:bCs/>
+        </w:rPr>
+        <w:t xml:space="preserve">Level:</w:t>
+      </w:r>
+      <w:r>
+        <w:t xml:space="preserve"> </w:t>
+      </w:r>
+      <w:r>
+        <w:t xml:space="preserve">User goal</w:t>
+      </w:r>
+    </w:p>
+    <w:p>
+      <w:pPr>
+        <w:pStyle w:val="Compact"/>
+        <w:numPr>
+          <w:ilvl w:val="0"/>
+          <w:numId w:val="1022"/>
+        </w:numPr>
+      </w:pPr>
+      <w:r>
+        <w:rPr>
+          <w:b/>
+          <w:bCs/>
+        </w:rPr>
+        <w:t xml:space="preserve">Primary Actor:</w:t>
+      </w:r>
+      <w:r>
+        <w:t xml:space="preserve"> </w:t>
+      </w:r>
+      <w:r>
+        <w:t xml:space="preserve">Super Admin</w:t>
+      </w:r>
+    </w:p>
+    <w:p>
+      <w:pPr>
+        <w:pStyle w:val="Compact"/>
+        <w:numPr>
+          <w:ilvl w:val="0"/>
+          <w:numId w:val="1022"/>
+        </w:numPr>
+      </w:pPr>
+      <w:r>
+        <w:rPr>
+          <w:b/>
+          <w:bCs/>
+        </w:rPr>
+        <w:t xml:space="preserve">Stakeholders and Interests:</w:t>
+      </w:r>
+    </w:p>
+    <w:p>
+      <w:pPr>
+        <w:pStyle w:val="Compact"/>
+        <w:numPr>
+          <w:ilvl w:val="1"/>
+          <w:numId w:val="1023"/>
+        </w:numPr>
+      </w:pPr>
+      <w:r>
+        <w:rPr>
+          <w:i/>
+          <w:iCs/>
+        </w:rPr>
+        <w:t xml:space="preserve">Super Admin:</w:t>
+      </w:r>
+      <w:r>
+        <w:t xml:space="preserve"> </w:t>
+      </w:r>
+      <w:r>
+        <w:t xml:space="preserve">Wants a fast, reliable way to bring a new hire into the system with the correct permissions, correct their details or role later, and remove someone who has left.</w:t>
+      </w:r>
+    </w:p>
+    <w:p>
+      <w:pPr>
+        <w:pStyle w:val="Compact"/>
+        <w:numPr>
+          <w:ilvl w:val="1"/>
+          <w:numId w:val="1023"/>
+        </w:numPr>
+      </w:pPr>
+      <w:r>
+        <w:rPr>
+          <w:i/>
+          <w:iCs/>
+        </w:rPr>
+        <w:t xml:space="preserve">Store Manager:</w:t>
+      </w:r>
+      <w:r>
+        <w:t xml:space="preserve"> </w:t>
+      </w:r>
+      <w:r>
+        <w:t xml:space="preserve">Wants new cashiers usable on the register on their first shift.</w:t>
+      </w:r>
+    </w:p>
+    <w:p>
+      <w:pPr>
+        <w:pStyle w:val="Compact"/>
+        <w:numPr>
+          <w:ilvl w:val="1"/>
+          <w:numId w:val="1023"/>
+        </w:numPr>
+      </w:pPr>
+      <w:r>
+        <w:rPr>
+          <w:i/>
+          <w:iCs/>
+        </w:rPr>
+        <w:t xml:space="preserve">New Employee:</w:t>
+      </w:r>
+      <w:r>
+        <w:t xml:space="preserve"> </w:t>
+      </w:r>
+      <w:r>
+        <w:t xml:space="preserve">Wants working credentials from day one.</w:t>
+      </w:r>
+    </w:p>
+    <w:p>
+      <w:pPr>
+        <w:pStyle w:val="Compact"/>
+        <w:numPr>
+          <w:ilvl w:val="0"/>
+          <w:numId w:val="1022"/>
+        </w:numPr>
+      </w:pPr>
+      <w:r>
+        <w:rPr>
+          <w:b/>
+          <w:bCs/>
+        </w:rPr>
+        <w:t xml:space="preserve">Preconditions:</w:t>
+      </w:r>
+      <w:r>
+        <w:t xml:space="preserve"> </w:t>
+      </w:r>
+      <w:r>
+        <w:t xml:space="preserve">Actor is logged in as Super Admin (see UC1: Login).</w:t>
+      </w:r>
+    </w:p>
+    <w:p>
+      <w:pPr>
+        <w:pStyle w:val="Compact"/>
+        <w:numPr>
+          <w:ilvl w:val="0"/>
+          <w:numId w:val="1022"/>
+        </w:numPr>
+      </w:pPr>
+      <w:r>
+        <w:rPr>
+          <w:b/>
+          <w:bCs/>
+        </w:rPr>
+        <w:t xml:space="preserve">Success Guarantee (Postconditions):</w:t>
+      </w:r>
+      <w:r>
+        <w:t xml:space="preserve"> </w:t>
+      </w:r>
+      <w:r>
+        <w:t xml:space="preserve">The employee record reflects the create/edit/role-change/removal. A newly onboarded employee can immediately log in with their role's permissions; a removed employee can no longer log in.</w:t>
+      </w:r>
+    </w:p>
+    <w:bookmarkStart w:id="25" w:name="main-success-scenario-onboard"/>
+    <w:p>
+      <w:pPr>
+        <w:pStyle w:val="Heading3"/>
+      </w:pPr>
+      <w:r>
+        <w:t xml:space="preserve">Main Success Scenario (Onboard)</w:t>
+      </w:r>
+    </w:p>
+    <w:p>
+      <w:pPr>
+        <w:pStyle w:val="Compact"/>
+        <w:numPr>
+          <w:ilvl w:val="0"/>
+          <w:numId w:val="1024"/>
+        </w:numPr>
+      </w:pPr>
+      <w:r>
+        <w:t xml:space="preserve">Super Admin selects "Onboard Employee."</w:t>
+      </w:r>
+    </w:p>
+    <w:p>
+      <w:pPr>
+        <w:pStyle w:val="Compact"/>
+        <w:numPr>
+          <w:ilvl w:val="0"/>
+          <w:numId w:val="1024"/>
+        </w:numPr>
+      </w:pPr>
+      <w:r>
+        <w:t xml:space="preserve">Super Admin enters the new employee's name, a unique username, an initial password, and selects a role.</w:t>
+      </w:r>
+    </w:p>
+    <w:p>
+      <w:pPr>
+        <w:pStyle w:val="Compact"/>
+        <w:numPr>
+          <w:ilvl w:val="0"/>
+          <w:numId w:val="1024"/>
+        </w:numPr>
+      </w:pPr>
+      <w:r>
+        <w:t xml:space="preserve">System validates the username is not already taken and the role is one of the three valid roles.</w:t>
+      </w:r>
+    </w:p>
+    <w:p>
+      <w:pPr>
+        <w:pStyle w:val="Compact"/>
+        <w:numPr>
+          <w:ilvl w:val="0"/>
+          <w:numId w:val="1024"/>
+        </w:numPr>
+      </w:pPr>
+      <w:r>
+        <w:t xml:space="preserve">System hashes the password, creates the employee record, and confirms creation to the Super Admin.</w:t>
+      </w:r>
+    </w:p>
+    <w:p>
+      <w:pPr>
+        <w:pStyle w:val="Compact"/>
+        <w:numPr>
+          <w:ilvl w:val="0"/>
+          <w:numId w:val="1024"/>
+        </w:numPr>
+      </w:pPr>
+      <w:r>
+        <w:t xml:space="preserve">Super Admin communicates the initial credentials to the new employee out of band (this system does not email credentials in this iteration).</w:t>
+      </w:r>
+    </w:p>
+    <w:bookmarkEnd w:id="25"/>
+    <w:bookmarkStart w:id="26" w:name="alternate-flow-a-edit-employee-details"/>
+    <w:p>
+      <w:pPr>
+        <w:pStyle w:val="Heading3"/>
+      </w:pPr>
+      <w:r>
+        <w:t xml:space="preserve">Alternate Flow A: Edit Employee Details</w:t>
+      </w:r>
+    </w:p>
+    <w:p>
+      <w:pPr>
+        <w:pStyle w:val="Compact"/>
+        <w:numPr>
+          <w:ilvl w:val="0"/>
+          <w:numId w:val="1025"/>
+        </w:numPr>
+      </w:pPr>
+      <w:r>
+        <w:t xml:space="preserve">Super Admin selects an existing employee from the employee list.</w:t>
+      </w:r>
+    </w:p>
+    <w:p>
+      <w:pPr>
+        <w:pStyle w:val="Compact"/>
+        <w:numPr>
+          <w:ilvl w:val="0"/>
+          <w:numId w:val="1025"/>
+        </w:numPr>
+      </w:pPr>
+      <w:r>
+        <w:t xml:space="preserve">Super Admin edits the employee's name and/or username.</w:t>
+      </w:r>
+    </w:p>
+    <w:p>
+      <w:pPr>
+        <w:pStyle w:val="Compact"/>
+        <w:numPr>
+          <w:ilvl w:val="0"/>
+          <w:numId w:val="1025"/>
+        </w:numPr>
+      </w:pPr>
+      <w:r>
+        <w:t xml:space="preserve">System validates (e.g. username still unique) and saves the changes.</w:t>
+      </w:r>
+    </w:p>
+    <w:p>
+      <w:pPr>
+        <w:pStyle w:val="Compact"/>
+        <w:numPr>
+          <w:ilvl w:val="0"/>
+          <w:numId w:val="1025"/>
+        </w:numPr>
+      </w:pPr>
+      <w:r>
+        <w:t xml:space="preserve">System confirms.</w:t>
+      </w:r>
+    </w:p>
+    <w:bookmarkEnd w:id="26"/>
+    <w:bookmarkStart w:id="27" w:name="alternate-flow-b-assignchange-role"/>
+    <w:p>
+      <w:pPr>
+        <w:pStyle w:val="Heading3"/>
+      </w:pPr>
+      <w:r>
+        <w:t xml:space="preserve">Alternate Flow B: Assign/Change Role</w:t>
+      </w:r>
+    </w:p>
+    <w:p>
+      <w:pPr>
+        <w:pStyle w:val="Compact"/>
+        <w:numPr>
+          <w:ilvl w:val="0"/>
+          <w:numId w:val="1026"/>
+        </w:numPr>
+      </w:pPr>
+      <w:r>
+        <w:t xml:space="preserve">Super Admin selects an existing employee from the employee list.</w:t>
+      </w:r>
+    </w:p>
+    <w:p>
+      <w:pPr>
+        <w:pStyle w:val="Compact"/>
+        <w:numPr>
+          <w:ilvl w:val="0"/>
+          <w:numId w:val="1026"/>
+        </w:numPr>
+      </w:pPr>
+      <w:r>
+        <w:t xml:space="preserve">Super Admin selects a new role for that employee.</w:t>
+      </w:r>
+    </w:p>
+    <w:p>
+      <w:pPr>
+        <w:pStyle w:val="Compact"/>
+        <w:numPr>
+          <w:ilvl w:val="0"/>
+          <w:numId w:val="1026"/>
+        </w:numPr>
+      </w:pPr>
+      <w:r>
+        <w:t xml:space="preserve">System updates the employee's role and confirms.</w:t>
+      </w:r>
+    </w:p>
+    <w:bookmarkEnd w:id="27"/>
+    <w:bookmarkStart w:id="28" w:name="alternate-flow-c-remove-employee"/>
+    <w:p>
+      <w:pPr>
+        <w:pStyle w:val="Heading3"/>
+      </w:pPr>
+      <w:r>
+        <w:t xml:space="preserve">Alternate Flow C: Remove Employee</w:t>
+      </w:r>
+    </w:p>
+    <w:p>
+      <w:pPr>
+        <w:pStyle w:val="Compact"/>
+        <w:numPr>
+          <w:ilvl w:val="0"/>
+          <w:numId w:val="1027"/>
+        </w:numPr>
+      </w:pPr>
+      <w:r>
+        <w:t xml:space="preserve">Super Admin selects an existing employee and requests removal.</w:t>
+      </w:r>
+    </w:p>
+    <w:p>
+      <w:pPr>
+        <w:pStyle w:val="Compact"/>
+        <w:numPr>
+          <w:ilvl w:val="0"/>
+          <w:numId w:val="1027"/>
+        </w:numPr>
+      </w:pPr>
+      <w:r>
+        <w:t xml:space="preserve">System deactivates the employee's account (soft delete —</w:t>
+      </w:r>
+      <w:r>
+        <w:t xml:space="preserve"> </w:t>
+      </w:r>
+      <w:r>
+        <w:rPr>
+          <w:rStyle w:val="VerbatimChar"/>
+        </w:rPr>
+        <w:t xml:space="preserve">is_active = 0</w:t>
+      </w:r>
+      <w:r>
+        <w:t xml:space="preserve">, not a hard delete) so their historical sales/stock-adjustment records remain intact and attributable.</w:t>
+      </w:r>
+    </w:p>
+    <w:p>
+      <w:pPr>
+        <w:pStyle w:val="Compact"/>
+        <w:numPr>
+          <w:ilvl w:val="0"/>
+          <w:numId w:val="1027"/>
+        </w:numPr>
+      </w:pPr>
+      <w:r>
+        <w:t xml:space="preserve">System confirms; the employee can no longer log in (UC1 extension 2b already handles a disabled account at login).</w:t>
+      </w:r>
+    </w:p>
+    <w:bookmarkEnd w:id="28"/>
+    <w:bookmarkStart w:id="29" w:name="extensions-4"/>
+    <w:p>
+      <w:pPr>
+        <w:pStyle w:val="Heading3"/>
+      </w:pPr>
+      <w:r>
+        <w:t xml:space="preserve">Extensions</w:t>
+      </w:r>
+    </w:p>
+    <w:p>
+      <w:pPr>
+        <w:pStyle w:val="Compact"/>
+        <w:numPr>
+          <w:ilvl w:val="0"/>
+          <w:numId w:val="1028"/>
+        </w:numPr>
+      </w:pPr>
+      <w:r>
+        <w:rPr>
+          <w:b/>
+          <w:bCs/>
+        </w:rPr>
+        <w:t xml:space="preserve">3a (Onboard).</w:t>
+      </w:r>
+      <w:r>
+        <w:t xml:space="preserve"> </w:t>
+      </w:r>
+      <w:r>
+        <w:t xml:space="preserve">Username already taken -&gt; System rejects the request; Super Admin picks a different username.</w:t>
+      </w:r>
+    </w:p>
+    <w:p>
+      <w:pPr>
+        <w:pStyle w:val="Compact"/>
+        <w:numPr>
+          <w:ilvl w:val="0"/>
+          <w:numId w:val="1028"/>
+        </w:numPr>
+      </w:pPr>
+      <w:r>
+        <w:rPr>
+          <w:b/>
+          <w:bCs/>
+        </w:rPr>
+        <w:t xml:space="preserve">3b (Onboard).</w:t>
+      </w:r>
+      <w:r>
+        <w:t xml:space="preserve"> </w:t>
+      </w:r>
+      <w:r>
+        <w:t xml:space="preserve">Invalid role value -&gt; System rejects the request; only</w:t>
+      </w:r>
+      <w:r>
+        <w:t xml:space="preserve"> </w:t>
+      </w:r>
+      <w:r>
+        <w:rPr>
+          <w:rStyle w:val="VerbatimChar"/>
+        </w:rPr>
+        <w:t xml:space="preserve">cashier</w:t>
+      </w:r>
+      <w:r>
+        <w:t xml:space="preserve">,</w:t>
+      </w:r>
+      <w:r>
+        <w:t xml:space="preserve"> </w:t>
+      </w:r>
+      <w:r>
+        <w:rPr>
+          <w:rStyle w:val="VerbatimChar"/>
+        </w:rPr>
+        <w:t xml:space="preserve">manager</w:t>
+      </w:r>
+      <w:r>
+        <w:t xml:space="preserve">,</w:t>
+      </w:r>
+      <w:r>
+        <w:t xml:space="preserve"> </w:t>
+      </w:r>
+      <w:r>
+        <w:rPr>
+          <w:rStyle w:val="VerbatimChar"/>
+        </w:rPr>
+        <w:t xml:space="preserve">superadmin</w:t>
+      </w:r>
+      <w:r>
+        <w:t xml:space="preserve"> </w:t>
+      </w:r>
+      <w:r>
+        <w:t xml:space="preserve">are accepted.</w:t>
+      </w:r>
+    </w:p>
+    <w:p>
+      <w:pPr>
+        <w:pStyle w:val="Compact"/>
+        <w:numPr>
+          <w:ilvl w:val="0"/>
+          <w:numId w:val="1028"/>
+        </w:numPr>
+      </w:pPr>
+      <w:r>
+        <w:rPr>
+          <w:b/>
+          <w:bCs/>
+        </w:rPr>
+        <w:t xml:space="preserve">3c (Onboard).</w:t>
+      </w:r>
+      <w:r>
+        <w:t xml:space="preserve"> </w:t>
+      </w:r>
+      <w:r>
+        <w:t xml:space="preserve">Weak/empty password -&gt; System rejects the request with a minimum-length requirement (suggest: 8+ characters, matching typical course-project security expectations).</w:t>
+      </w:r>
+    </w:p>
+    <w:p>
+      <w:pPr>
+        <w:pStyle w:val="Compact"/>
+        <w:numPr>
+          <w:ilvl w:val="0"/>
+          <w:numId w:val="1028"/>
+        </w:numPr>
+      </w:pPr>
+      <w:r>
+        <w:rPr>
+          <w:b/>
+          <w:bCs/>
+        </w:rPr>
+        <w:t xml:space="preserve">3a (Edit).</w:t>
+      </w:r>
+      <w:r>
+        <w:t xml:space="preserve"> </w:t>
+      </w:r>
+      <w:r>
+        <w:t xml:space="preserve">New username already taken by another employee -&gt; System rejects.</w:t>
+      </w:r>
+    </w:p>
+    <w:p>
+      <w:pPr>
+        <w:pStyle w:val="Compact"/>
+        <w:numPr>
+          <w:ilvl w:val="0"/>
+          <w:numId w:val="1028"/>
+        </w:numPr>
+      </w:pPr>
+      <w:r>
+        <w:rPr>
+          <w:b/>
+          <w:bCs/>
+        </w:rPr>
+        <w:t xml:space="preserve">1a (Assign/Change Role, Remove).</w:t>
+      </w:r>
+      <w:r>
+        <w:t xml:space="preserve"> </w:t>
+      </w:r>
+      <w:r>
+        <w:t xml:space="preserve">Super Admin targets their own account (self-demotion or self-removal), or the last remaining active Super Admin -&gt; System warns and requires confirmation, since it can strand the store with no Super Admin. Deciding the exact safeguard is an open design question for whoever implements this (see the design note below).</w:t>
+      </w:r>
+    </w:p>
+    <w:bookmarkEnd w:id="29"/>
+    <w:bookmarkStart w:id="31" w:name="design-note-for-implementer"/>
+    <w:p>
+      <w:pPr>
+        <w:pStyle w:val="Heading3"/>
+      </w:pPr>
+      <w:r>
+        <w:t xml:space="preserve">Design Note for Implementer</w:t>
+      </w:r>
+    </w:p>
+    <w:p>
+      <w:pPr>
+        <w:pStyle w:val="FirstParagraph"/>
+      </w:pPr>
+      <w:r>
+        <w:t xml:space="preserve">This use case's design should also serve as the specification for the role-based access control already enforced (by convention) across UC1-UC3 — i.e., implementing this is a good forcing function to double check every existing route's</w:t>
+      </w:r>
+      <w:r>
+        <w:t xml:space="preserve"> </w:t>
+      </w:r>
+      <w:r>
+        <w:rPr>
+          <w:rStyle w:val="VerbatimChar"/>
+        </w:rPr>
+        <w:t xml:space="preserve">requireRole(...)</w:t>
+      </w:r>
+      <w:r>
+        <w:t xml:space="preserve"> </w:t>
+      </w:r>
+      <w:r>
+        <w:t xml:space="preserve">list against</w:t>
+      </w:r>
+      <w:r>
+        <w:t xml:space="preserve"> </w:t>
+      </w:r>
+      <w:hyperlink r:id="rId30">
+        <w:r>
+          <w:rPr>
+            <w:rStyle w:val="Hyperlink"/>
+          </w:rPr>
+          <w:t xml:space="preserve">Domain Model</w:t>
+        </w:r>
+      </w:hyperlink>
+      <w:r>
+        <w:t xml:space="preserve">'s "Super Admin has access to all roles" rule.</w:t>
+      </w:r>
+    </w:p>
+    <w:p>
+      <w:r>
+        <w:pict>
+          <v:rect style="width:0;height:1.5pt" o:hralign="center" o:hrstd="t" o:hr="t"/>
+        </w:pict>
+      </w:r>
+    </w:p>
+    <w:bookmarkEnd w:id="31"/>
+    <w:bookmarkEnd w:id="32"/>
+    <w:bookmarkStart w:id="33" w:name="remaining-use-cases-70"/>
+    <w:p>
+      <w:pPr>
+        <w:pStyle w:val="Heading2"/>
+      </w:pPr>
+      <w:r>
         <w:t xml:space="preserve">Remaining Use Cases (70%)</w:t>
       </w:r>
     </w:p>
@@ -1275,48 +2418,27 @@
         <w:pStyle w:val="FirstParagraph"/>
       </w:pPr>
       <w:r>
-        <w:t xml:space="preserve">The remaining 5 use cases from the high-level requirements —</w:t>
-      </w:r>
-      <w:r>
-        <w:t xml:space="preserve"> </w:t>
-      </w:r>
-      <w:r>
-        <w:rPr>
-          <w:b/>
-          <w:bCs/>
-        </w:rPr>
-        <w:t xml:space="preserve">View Stock Levels, Generate Sales Reports, Manage Employees, Register Customer, and Onboard Employee &amp; Assign Role (Super Admin)</w:t>
-      </w:r>
-      <w:r>
-        <w:t xml:space="preserve"> </w:t>
-      </w:r>
-      <w:r>
-        <w:t xml:space="preserve">— are deferred to Elaboration Iteration 2, per the course's iteration plan.</w:t>
-      </w:r>
-    </w:p>
-    <w:p>
-      <w:pPr>
-        <w:pStyle w:val="BodyText"/>
-      </w:pPr>
-      <w:r>
-        <w:t xml:space="preserve">Note on scope for</w:t>
-      </w:r>
-      <w:r>
-        <w:t xml:space="preserve"> </w:t>
-      </w:r>
-      <w:r>
-        <w:rPr>
-          <w:b/>
-          <w:bCs/>
-        </w:rPr>
-        <w:t xml:space="preserve">Onboard Employee &amp; Assign Role</w:t>
-      </w:r>
-      <w:r>
-        <w:t xml:space="preserve">: this use case's primary actor is the Super Admin, who is the only actor permitted to create employee accounts and assign them a role (Cashier, Store Manager, or Super Admin). Because the Super Admin also has the combined permissions of every other role, this use case's design (Elaboration Iteration 2) should double as the specification for the role-based access control enforced across all other use cases.</w:t>
-      </w:r>
-    </w:p>
-    <w:bookmarkEnd w:id="20"/>
-    <w:bookmarkEnd w:id="21"/>
+        <w:t xml:space="preserve">UC4 and UC5 above are now detailed. The remaining 3 use cases from the high-level requirements —</w:t>
+      </w:r>
+      <w:r>
+        <w:t xml:space="preserve"> </w:t>
+      </w:r>
+      <w:r>
+        <w:rPr>
+          <w:b/>
+          <w:bCs/>
+        </w:rPr>
+        <w:t xml:space="preserve">View Stock Levels, Generate Sales Reports, and Register Customer</w:t>
+      </w:r>
+      <w:r>
+        <w:t xml:space="preserve"> </w:t>
+      </w:r>
+      <w:r>
+        <w:t xml:space="preserve">— are still deferred to later Elaboration/Construction iterations.</w:t>
+      </w:r>
+    </w:p>
+    <w:bookmarkEnd w:id="33"/>
+    <w:bookmarkEnd w:id="34"/>
     <w:sectPr>
       <w:footnotePr>
         <w:numRestart w:val="eachSect"/>
@@ -1796,6 +2918,234 @@
     </w:lvlOverride>
   </w:num>
   <w:num w:numId="1015">
+    <w:abstractNumId w:val="991"/>
+  </w:num>
+  <w:num w:numId="1016">
+    <w:abstractNumId w:val="991"/>
+  </w:num>
+  <w:num w:numId="1017">
+    <w:abstractNumId w:val="991"/>
+  </w:num>
+  <w:num w:numId="1018">
+    <w:abstractNumId w:val="99411"/>
+    <w:lvlOverride w:ilvl="0">
+      <w:startOverride w:val="1"/>
+    </w:lvlOverride>
+    <w:lvlOverride w:ilvl="1">
+      <w:startOverride w:val="1"/>
+    </w:lvlOverride>
+    <w:lvlOverride w:ilvl="2">
+      <w:startOverride w:val="1"/>
+    </w:lvlOverride>
+    <w:lvlOverride w:ilvl="3">
+      <w:startOverride w:val="1"/>
+    </w:lvlOverride>
+    <w:lvlOverride w:ilvl="4">
+      <w:startOverride w:val="1"/>
+    </w:lvlOverride>
+    <w:lvlOverride w:ilvl="5">
+      <w:startOverride w:val="1"/>
+    </w:lvlOverride>
+    <w:lvlOverride w:ilvl="6">
+      <w:startOverride w:val="1"/>
+    </w:lvlOverride>
+    <w:lvlOverride w:ilvl="7">
+      <w:startOverride w:val="1"/>
+    </w:lvlOverride>
+    <w:lvlOverride w:ilvl="8">
+      <w:startOverride w:val="1"/>
+    </w:lvlOverride>
+  </w:num>
+  <w:num w:numId="1019">
+    <w:abstractNumId w:val="99411"/>
+    <w:lvlOverride w:ilvl="0">
+      <w:startOverride w:val="1"/>
+    </w:lvlOverride>
+    <w:lvlOverride w:ilvl="1">
+      <w:startOverride w:val="1"/>
+    </w:lvlOverride>
+    <w:lvlOverride w:ilvl="2">
+      <w:startOverride w:val="1"/>
+    </w:lvlOverride>
+    <w:lvlOverride w:ilvl="3">
+      <w:startOverride w:val="1"/>
+    </w:lvlOverride>
+    <w:lvlOverride w:ilvl="4">
+      <w:startOverride w:val="1"/>
+    </w:lvlOverride>
+    <w:lvlOverride w:ilvl="5">
+      <w:startOverride w:val="1"/>
+    </w:lvlOverride>
+    <w:lvlOverride w:ilvl="6">
+      <w:startOverride w:val="1"/>
+    </w:lvlOverride>
+    <w:lvlOverride w:ilvl="7">
+      <w:startOverride w:val="1"/>
+    </w:lvlOverride>
+    <w:lvlOverride w:ilvl="8">
+      <w:startOverride w:val="1"/>
+    </w:lvlOverride>
+  </w:num>
+  <w:num w:numId="1020">
+    <w:abstractNumId w:val="99411"/>
+    <w:lvlOverride w:ilvl="0">
+      <w:startOverride w:val="1"/>
+    </w:lvlOverride>
+    <w:lvlOverride w:ilvl="1">
+      <w:startOverride w:val="1"/>
+    </w:lvlOverride>
+    <w:lvlOverride w:ilvl="2">
+      <w:startOverride w:val="1"/>
+    </w:lvlOverride>
+    <w:lvlOverride w:ilvl="3">
+      <w:startOverride w:val="1"/>
+    </w:lvlOverride>
+    <w:lvlOverride w:ilvl="4">
+      <w:startOverride w:val="1"/>
+    </w:lvlOverride>
+    <w:lvlOverride w:ilvl="5">
+      <w:startOverride w:val="1"/>
+    </w:lvlOverride>
+    <w:lvlOverride w:ilvl="6">
+      <w:startOverride w:val="1"/>
+    </w:lvlOverride>
+    <w:lvlOverride w:ilvl="7">
+      <w:startOverride w:val="1"/>
+    </w:lvlOverride>
+    <w:lvlOverride w:ilvl="8">
+      <w:startOverride w:val="1"/>
+    </w:lvlOverride>
+  </w:num>
+  <w:num w:numId="1021">
+    <w:abstractNumId w:val="991"/>
+  </w:num>
+  <w:num w:numId="1022">
+    <w:abstractNumId w:val="991"/>
+  </w:num>
+  <w:num w:numId="1023">
+    <w:abstractNumId w:val="991"/>
+  </w:num>
+  <w:num w:numId="1024">
+    <w:abstractNumId w:val="99411"/>
+    <w:lvlOverride w:ilvl="0">
+      <w:startOverride w:val="1"/>
+    </w:lvlOverride>
+    <w:lvlOverride w:ilvl="1">
+      <w:startOverride w:val="1"/>
+    </w:lvlOverride>
+    <w:lvlOverride w:ilvl="2">
+      <w:startOverride w:val="1"/>
+    </w:lvlOverride>
+    <w:lvlOverride w:ilvl="3">
+      <w:startOverride w:val="1"/>
+    </w:lvlOverride>
+    <w:lvlOverride w:ilvl="4">
+      <w:startOverride w:val="1"/>
+    </w:lvlOverride>
+    <w:lvlOverride w:ilvl="5">
+      <w:startOverride w:val="1"/>
+    </w:lvlOverride>
+    <w:lvlOverride w:ilvl="6">
+      <w:startOverride w:val="1"/>
+    </w:lvlOverride>
+    <w:lvlOverride w:ilvl="7">
+      <w:startOverride w:val="1"/>
+    </w:lvlOverride>
+    <w:lvlOverride w:ilvl="8">
+      <w:startOverride w:val="1"/>
+    </w:lvlOverride>
+  </w:num>
+  <w:num w:numId="1025">
+    <w:abstractNumId w:val="99411"/>
+    <w:lvlOverride w:ilvl="0">
+      <w:startOverride w:val="1"/>
+    </w:lvlOverride>
+    <w:lvlOverride w:ilvl="1">
+      <w:startOverride w:val="1"/>
+    </w:lvlOverride>
+    <w:lvlOverride w:ilvl="2">
+      <w:startOverride w:val="1"/>
+    </w:lvlOverride>
+    <w:lvlOverride w:ilvl="3">
+      <w:startOverride w:val="1"/>
+    </w:lvlOverride>
+    <w:lvlOverride w:ilvl="4">
+      <w:startOverride w:val="1"/>
+    </w:lvlOverride>
+    <w:lvlOverride w:ilvl="5">
+      <w:startOverride w:val="1"/>
+    </w:lvlOverride>
+    <w:lvlOverride w:ilvl="6">
+      <w:startOverride w:val="1"/>
+    </w:lvlOverride>
+    <w:lvlOverride w:ilvl="7">
+      <w:startOverride w:val="1"/>
+    </w:lvlOverride>
+    <w:lvlOverride w:ilvl="8">
+      <w:startOverride w:val="1"/>
+    </w:lvlOverride>
+  </w:num>
+  <w:num w:numId="1026">
+    <w:abstractNumId w:val="99411"/>
+    <w:lvlOverride w:ilvl="0">
+      <w:startOverride w:val="1"/>
+    </w:lvlOverride>
+    <w:lvlOverride w:ilvl="1">
+      <w:startOverride w:val="1"/>
+    </w:lvlOverride>
+    <w:lvlOverride w:ilvl="2">
+      <w:startOverride w:val="1"/>
+    </w:lvlOverride>
+    <w:lvlOverride w:ilvl="3">
+      <w:startOverride w:val="1"/>
+    </w:lvlOverride>
+    <w:lvlOverride w:ilvl="4">
+      <w:startOverride w:val="1"/>
+    </w:lvlOverride>
+    <w:lvlOverride w:ilvl="5">
+      <w:startOverride w:val="1"/>
+    </w:lvlOverride>
+    <w:lvlOverride w:ilvl="6">
+      <w:startOverride w:val="1"/>
+    </w:lvlOverride>
+    <w:lvlOverride w:ilvl="7">
+      <w:startOverride w:val="1"/>
+    </w:lvlOverride>
+    <w:lvlOverride w:ilvl="8">
+      <w:startOverride w:val="1"/>
+    </w:lvlOverride>
+  </w:num>
+  <w:num w:numId="1027">
+    <w:abstractNumId w:val="99411"/>
+    <w:lvlOverride w:ilvl="0">
+      <w:startOverride w:val="1"/>
+    </w:lvlOverride>
+    <w:lvlOverride w:ilvl="1">
+      <w:startOverride w:val="1"/>
+    </w:lvlOverride>
+    <w:lvlOverride w:ilvl="2">
+      <w:startOverride w:val="1"/>
+    </w:lvlOverride>
+    <w:lvlOverride w:ilvl="3">
+      <w:startOverride w:val="1"/>
+    </w:lvlOverride>
+    <w:lvlOverride w:ilvl="4">
+      <w:startOverride w:val="1"/>
+    </w:lvlOverride>
+    <w:lvlOverride w:ilvl="5">
+      <w:startOverride w:val="1"/>
+    </w:lvlOverride>
+    <w:lvlOverride w:ilvl="6">
+      <w:startOverride w:val="1"/>
+    </w:lvlOverride>
+    <w:lvlOverride w:ilvl="7">
+      <w:startOverride w:val="1"/>
+    </w:lvlOverride>
+    <w:lvlOverride w:ilvl="8">
+      <w:startOverride w:val="1"/>
+    </w:lvlOverride>
+  </w:num>
+  <w:num w:numId="1028">
     <w:abstractNumId w:val="991"/>
   </w:num>
 </w:numbering>

</xml_diff>